<commit_message>
Release Navigator Build 023 candidate
</commit_message>
<xml_diff>
--- a/docs/guides/VCL2FMXConverter_v6_0_Navigator_Engineering_Guide.docx
+++ b/docs/guides/VCL2FMXConverter_v6_0_Navigator_Engineering_Guide.docx
@@ -251,7 +251,7 @@
           <w:r>
             <w:fldChar w:fldCharType="separate"/>
           </w:r>
-          <w:hyperlink w:anchor="_Toc236486257" w:history="1">
+          <w:hyperlink w:anchor="_Toc236592906" w:history="1">
             <w:r>
               <w:rPr>
                 <w:rStyle w:val="Hyperlink"/>
@@ -278,7 +278,7 @@
                 <w:noProof/>
                 <w:webHidden/>
               </w:rPr>
-              <w:instrText xml:space="preserve"> PAGEREF _Toc236486257 \h </w:instrText>
+              <w:instrText xml:space="preserve"> PAGEREF _Toc236592906 \h </w:instrText>
             </w:r>
             <w:r>
               <w:rPr>
@@ -321,7 +321,7 @@
               <w:sz w:val="24"/>
             </w:rPr>
           </w:pPr>
-          <w:hyperlink w:anchor="_Toc236486258" w:history="1">
+          <w:hyperlink w:anchor="_Toc236592907" w:history="1">
             <w:r>
               <w:rPr>
                 <w:rStyle w:val="Hyperlink"/>
@@ -348,7 +348,7 @@
                 <w:noProof/>
                 <w:webHidden/>
               </w:rPr>
-              <w:instrText xml:space="preserve"> PAGEREF _Toc236486258 \h </w:instrText>
+              <w:instrText xml:space="preserve"> PAGEREF _Toc236592907 \h </w:instrText>
             </w:r>
             <w:r>
               <w:rPr>
@@ -391,7 +391,7 @@
               <w:sz w:val="24"/>
             </w:rPr>
           </w:pPr>
-          <w:hyperlink w:anchor="_Toc236486259" w:history="1">
+          <w:hyperlink w:anchor="_Toc236592908" w:history="1">
             <w:r>
               <w:rPr>
                 <w:rStyle w:val="Hyperlink"/>
@@ -418,7 +418,7 @@
                 <w:noProof/>
                 <w:webHidden/>
               </w:rPr>
-              <w:instrText xml:space="preserve"> PAGEREF _Toc236486259 \h </w:instrText>
+              <w:instrText xml:space="preserve"> PAGEREF _Toc236592908 \h </w:instrText>
             </w:r>
             <w:r>
               <w:rPr>
@@ -461,7 +461,7 @@
               <w:sz w:val="24"/>
             </w:rPr>
           </w:pPr>
-          <w:hyperlink w:anchor="_Toc236486260" w:history="1">
+          <w:hyperlink w:anchor="_Toc236592909" w:history="1">
             <w:r>
               <w:rPr>
                 <w:rStyle w:val="Hyperlink"/>
@@ -488,7 +488,7 @@
                 <w:noProof/>
                 <w:webHidden/>
               </w:rPr>
-              <w:instrText xml:space="preserve"> PAGEREF _Toc236486260 \h </w:instrText>
+              <w:instrText xml:space="preserve"> PAGEREF _Toc236592909 \h </w:instrText>
             </w:r>
             <w:r>
               <w:rPr>
@@ -531,7 +531,7 @@
               <w:sz w:val="24"/>
             </w:rPr>
           </w:pPr>
-          <w:hyperlink w:anchor="_Toc236486261" w:history="1">
+          <w:hyperlink w:anchor="_Toc236592910" w:history="1">
             <w:r>
               <w:rPr>
                 <w:rStyle w:val="Hyperlink"/>
@@ -558,7 +558,7 @@
                 <w:noProof/>
                 <w:webHidden/>
               </w:rPr>
-              <w:instrText xml:space="preserve"> PAGEREF _Toc236486261 \h </w:instrText>
+              <w:instrText xml:space="preserve"> PAGEREF _Toc236592910 \h </w:instrText>
             </w:r>
             <w:r>
               <w:rPr>
@@ -601,7 +601,7 @@
               <w:sz w:val="24"/>
             </w:rPr>
           </w:pPr>
-          <w:hyperlink w:anchor="_Toc236486262" w:history="1">
+          <w:hyperlink w:anchor="_Toc236592911" w:history="1">
             <w:r>
               <w:rPr>
                 <w:rStyle w:val="Hyperlink"/>
@@ -628,7 +628,7 @@
                 <w:noProof/>
                 <w:webHidden/>
               </w:rPr>
-              <w:instrText xml:space="preserve"> PAGEREF _Toc236486262 \h </w:instrText>
+              <w:instrText xml:space="preserve"> PAGEREF _Toc236592911 \h </w:instrText>
             </w:r>
             <w:r>
               <w:rPr>
@@ -671,7 +671,7 @@
               <w:sz w:val="24"/>
             </w:rPr>
           </w:pPr>
-          <w:hyperlink w:anchor="_Toc236486263" w:history="1">
+          <w:hyperlink w:anchor="_Toc236592912" w:history="1">
             <w:r>
               <w:rPr>
                 <w:rStyle w:val="Hyperlink"/>
@@ -698,7 +698,7 @@
                 <w:noProof/>
                 <w:webHidden/>
               </w:rPr>
-              <w:instrText xml:space="preserve"> PAGEREF _Toc236486263 \h </w:instrText>
+              <w:instrText xml:space="preserve"> PAGEREF _Toc236592912 \h </w:instrText>
             </w:r>
             <w:r>
               <w:rPr>
@@ -741,7 +741,7 @@
               <w:sz w:val="24"/>
             </w:rPr>
           </w:pPr>
-          <w:hyperlink w:anchor="_Toc236486264" w:history="1">
+          <w:hyperlink w:anchor="_Toc236592913" w:history="1">
             <w:r>
               <w:rPr>
                 <w:rStyle w:val="Hyperlink"/>
@@ -768,7 +768,7 @@
                 <w:noProof/>
                 <w:webHidden/>
               </w:rPr>
-              <w:instrText xml:space="preserve"> PAGEREF _Toc236486264 \h </w:instrText>
+              <w:instrText xml:space="preserve"> PAGEREF _Toc236592913 \h </w:instrText>
             </w:r>
             <w:r>
               <w:rPr>
@@ -811,7 +811,7 @@
               <w:sz w:val="24"/>
             </w:rPr>
           </w:pPr>
-          <w:hyperlink w:anchor="_Toc236486265" w:history="1">
+          <w:hyperlink w:anchor="_Toc236592914" w:history="1">
             <w:r>
               <w:rPr>
                 <w:rStyle w:val="Hyperlink"/>
@@ -838,7 +838,7 @@
                 <w:noProof/>
                 <w:webHidden/>
               </w:rPr>
-              <w:instrText xml:space="preserve"> PAGEREF _Toc236486265 \h </w:instrText>
+              <w:instrText xml:space="preserve"> PAGEREF _Toc236592914 \h </w:instrText>
             </w:r>
             <w:r>
               <w:rPr>
@@ -881,7 +881,7 @@
               <w:sz w:val="24"/>
             </w:rPr>
           </w:pPr>
-          <w:hyperlink w:anchor="_Toc236486266" w:history="1">
+          <w:hyperlink w:anchor="_Toc236592915" w:history="1">
             <w:r>
               <w:rPr>
                 <w:rStyle w:val="Hyperlink"/>
@@ -908,7 +908,7 @@
                 <w:noProof/>
                 <w:webHidden/>
               </w:rPr>
-              <w:instrText xml:space="preserve"> PAGEREF _Toc236486266 \h </w:instrText>
+              <w:instrText xml:space="preserve"> PAGEREF _Toc236592915 \h </w:instrText>
             </w:r>
             <w:r>
               <w:rPr>
@@ -951,7 +951,7 @@
               <w:sz w:val="24"/>
             </w:rPr>
           </w:pPr>
-          <w:hyperlink w:anchor="_Toc236486267" w:history="1">
+          <w:hyperlink w:anchor="_Toc236592916" w:history="1">
             <w:r>
               <w:rPr>
                 <w:rStyle w:val="Hyperlink"/>
@@ -978,7 +978,7 @@
                 <w:noProof/>
                 <w:webHidden/>
               </w:rPr>
-              <w:instrText xml:space="preserve"> PAGEREF _Toc236486267 \h </w:instrText>
+              <w:instrText xml:space="preserve"> PAGEREF _Toc236592916 \h </w:instrText>
             </w:r>
             <w:r>
               <w:rPr>
@@ -1021,7 +1021,7 @@
               <w:sz w:val="24"/>
             </w:rPr>
           </w:pPr>
-          <w:hyperlink w:anchor="_Toc236486268" w:history="1">
+          <w:hyperlink w:anchor="_Toc236592917" w:history="1">
             <w:r>
               <w:rPr>
                 <w:rStyle w:val="Hyperlink"/>
@@ -1048,7 +1048,7 @@
                 <w:noProof/>
                 <w:webHidden/>
               </w:rPr>
-              <w:instrText xml:space="preserve"> PAGEREF _Toc236486268 \h </w:instrText>
+              <w:instrText xml:space="preserve"> PAGEREF _Toc236592917 \h </w:instrText>
             </w:r>
             <w:r>
               <w:rPr>
@@ -1091,7 +1091,7 @@
               <w:sz w:val="24"/>
             </w:rPr>
           </w:pPr>
-          <w:hyperlink w:anchor="_Toc236486269" w:history="1">
+          <w:hyperlink w:anchor="_Toc236592918" w:history="1">
             <w:r>
               <w:rPr>
                 <w:rStyle w:val="Hyperlink"/>
@@ -1118,7 +1118,7 @@
                 <w:noProof/>
                 <w:webHidden/>
               </w:rPr>
-              <w:instrText xml:space="preserve"> PAGEREF _Toc236486269 \h </w:instrText>
+              <w:instrText xml:space="preserve"> PAGEREF _Toc236592918 \h </w:instrText>
             </w:r>
             <w:r>
               <w:rPr>
@@ -1161,7 +1161,7 @@
               <w:sz w:val="24"/>
             </w:rPr>
           </w:pPr>
-          <w:hyperlink w:anchor="_Toc236486270" w:history="1">
+          <w:hyperlink w:anchor="_Toc236592919" w:history="1">
             <w:r>
               <w:rPr>
                 <w:rStyle w:val="Hyperlink"/>
@@ -1188,7 +1188,7 @@
                 <w:noProof/>
                 <w:webHidden/>
               </w:rPr>
-              <w:instrText xml:space="preserve"> PAGEREF _Toc236486270 \h </w:instrText>
+              <w:instrText xml:space="preserve"> PAGEREF _Toc236592919 \h </w:instrText>
             </w:r>
             <w:r>
               <w:rPr>
@@ -1231,7 +1231,7 @@
               <w:sz w:val="24"/>
             </w:rPr>
           </w:pPr>
-          <w:hyperlink w:anchor="_Toc236486271" w:history="1">
+          <w:hyperlink w:anchor="_Toc236592920" w:history="1">
             <w:r>
               <w:rPr>
                 <w:rStyle w:val="Hyperlink"/>
@@ -1258,7 +1258,7 @@
                 <w:noProof/>
                 <w:webHidden/>
               </w:rPr>
-              <w:instrText xml:space="preserve"> PAGEREF _Toc236486271 \h </w:instrText>
+              <w:instrText xml:space="preserve"> PAGEREF _Toc236592920 \h </w:instrText>
             </w:r>
             <w:r>
               <w:rPr>
@@ -1301,7 +1301,7 @@
               <w:sz w:val="24"/>
             </w:rPr>
           </w:pPr>
-          <w:hyperlink w:anchor="_Toc236486272" w:history="1">
+          <w:hyperlink w:anchor="_Toc236592921" w:history="1">
             <w:r>
               <w:rPr>
                 <w:rStyle w:val="Hyperlink"/>
@@ -1328,7 +1328,7 @@
                 <w:noProof/>
                 <w:webHidden/>
               </w:rPr>
-              <w:instrText xml:space="preserve"> PAGEREF _Toc236486272 \h </w:instrText>
+              <w:instrText xml:space="preserve"> PAGEREF _Toc236592921 \h </w:instrText>
             </w:r>
             <w:r>
               <w:rPr>
@@ -1371,7 +1371,7 @@
               <w:sz w:val="24"/>
             </w:rPr>
           </w:pPr>
-          <w:hyperlink w:anchor="_Toc236486273" w:history="1">
+          <w:hyperlink w:anchor="_Toc236592922" w:history="1">
             <w:r>
               <w:rPr>
                 <w:rStyle w:val="Hyperlink"/>
@@ -1398,7 +1398,7 @@
                 <w:noProof/>
                 <w:webHidden/>
               </w:rPr>
-              <w:instrText xml:space="preserve"> PAGEREF _Toc236486273 \h </w:instrText>
+              <w:instrText xml:space="preserve"> PAGEREF _Toc236592922 \h </w:instrText>
             </w:r>
             <w:r>
               <w:rPr>
@@ -1441,7 +1441,7 @@
               <w:sz w:val="24"/>
             </w:rPr>
           </w:pPr>
-          <w:hyperlink w:anchor="_Toc236486274" w:history="1">
+          <w:hyperlink w:anchor="_Toc236592923" w:history="1">
             <w:r>
               <w:rPr>
                 <w:rStyle w:val="Hyperlink"/>
@@ -1468,7 +1468,7 @@
                 <w:noProof/>
                 <w:webHidden/>
               </w:rPr>
-              <w:instrText xml:space="preserve"> PAGEREF _Toc236486274 \h </w:instrText>
+              <w:instrText xml:space="preserve"> PAGEREF _Toc236592923 \h </w:instrText>
             </w:r>
             <w:r>
               <w:rPr>
@@ -1511,7 +1511,7 @@
               <w:sz w:val="24"/>
             </w:rPr>
           </w:pPr>
-          <w:hyperlink w:anchor="_Toc236486275" w:history="1">
+          <w:hyperlink w:anchor="_Toc236592924" w:history="1">
             <w:r>
               <w:rPr>
                 <w:rStyle w:val="Hyperlink"/>
@@ -1538,7 +1538,7 @@
                 <w:noProof/>
                 <w:webHidden/>
               </w:rPr>
-              <w:instrText xml:space="preserve"> PAGEREF _Toc236486275 \h </w:instrText>
+              <w:instrText xml:space="preserve"> PAGEREF _Toc236592924 \h </w:instrText>
             </w:r>
             <w:r>
               <w:rPr>
@@ -1581,7 +1581,7 @@
               <w:sz w:val="24"/>
             </w:rPr>
           </w:pPr>
-          <w:hyperlink w:anchor="_Toc236486276" w:history="1">
+          <w:hyperlink w:anchor="_Toc236592925" w:history="1">
             <w:r>
               <w:rPr>
                 <w:rStyle w:val="Hyperlink"/>
@@ -1608,7 +1608,7 @@
                 <w:noProof/>
                 <w:webHidden/>
               </w:rPr>
-              <w:instrText xml:space="preserve"> PAGEREF _Toc236486276 \h </w:instrText>
+              <w:instrText xml:space="preserve"> PAGEREF _Toc236592925 \h </w:instrText>
             </w:r>
             <w:r>
               <w:rPr>
@@ -1651,7 +1651,7 @@
               <w:sz w:val="24"/>
             </w:rPr>
           </w:pPr>
-          <w:hyperlink w:anchor="_Toc236486277" w:history="1">
+          <w:hyperlink w:anchor="_Toc236592926" w:history="1">
             <w:r>
               <w:rPr>
                 <w:rStyle w:val="Hyperlink"/>
@@ -1678,7 +1678,7 @@
                 <w:noProof/>
                 <w:webHidden/>
               </w:rPr>
-              <w:instrText xml:space="preserve"> PAGEREF _Toc236486277 \h </w:instrText>
+              <w:instrText xml:space="preserve"> PAGEREF _Toc236592926 \h </w:instrText>
             </w:r>
             <w:r>
               <w:rPr>
@@ -1721,7 +1721,7 @@
               <w:sz w:val="24"/>
             </w:rPr>
           </w:pPr>
-          <w:hyperlink w:anchor="_Toc236486278" w:history="1">
+          <w:hyperlink w:anchor="_Toc236592927" w:history="1">
             <w:r>
               <w:rPr>
                 <w:rStyle w:val="Hyperlink"/>
@@ -1748,7 +1748,7 @@
                 <w:noProof/>
                 <w:webHidden/>
               </w:rPr>
-              <w:instrText xml:space="preserve"> PAGEREF _Toc236486278 \h </w:instrText>
+              <w:instrText xml:space="preserve"> PAGEREF _Toc236592927 \h </w:instrText>
             </w:r>
             <w:r>
               <w:rPr>
@@ -1791,7 +1791,7 @@
               <w:sz w:val="24"/>
             </w:rPr>
           </w:pPr>
-          <w:hyperlink w:anchor="_Toc236486279" w:history="1">
+          <w:hyperlink w:anchor="_Toc236592928" w:history="1">
             <w:r>
               <w:rPr>
                 <w:rStyle w:val="Hyperlink"/>
@@ -1818,7 +1818,7 @@
                 <w:noProof/>
                 <w:webHidden/>
               </w:rPr>
-              <w:instrText xml:space="preserve"> PAGEREF _Toc236486279 \h </w:instrText>
+              <w:instrText xml:space="preserve"> PAGEREF _Toc236592928 \h </w:instrText>
             </w:r>
             <w:r>
               <w:rPr>
@@ -1861,7 +1861,7 @@
               <w:sz w:val="24"/>
             </w:rPr>
           </w:pPr>
-          <w:hyperlink w:anchor="_Toc236486280" w:history="1">
+          <w:hyperlink w:anchor="_Toc236592929" w:history="1">
             <w:r>
               <w:rPr>
                 <w:rStyle w:val="Hyperlink"/>
@@ -1888,7 +1888,7 @@
                 <w:noProof/>
                 <w:webHidden/>
               </w:rPr>
-              <w:instrText xml:space="preserve"> PAGEREF _Toc236486280 \h </w:instrText>
+              <w:instrText xml:space="preserve"> PAGEREF _Toc236592929 \h </w:instrText>
             </w:r>
             <w:r>
               <w:rPr>
@@ -1931,7 +1931,7 @@
               <w:sz w:val="24"/>
             </w:rPr>
           </w:pPr>
-          <w:hyperlink w:anchor="_Toc236486281" w:history="1">
+          <w:hyperlink w:anchor="_Toc236592930" w:history="1">
             <w:r>
               <w:rPr>
                 <w:rStyle w:val="Hyperlink"/>
@@ -1958,7 +1958,7 @@
                 <w:noProof/>
                 <w:webHidden/>
               </w:rPr>
-              <w:instrText xml:space="preserve"> PAGEREF _Toc236486281 \h </w:instrText>
+              <w:instrText xml:space="preserve"> PAGEREF _Toc236592930 \h </w:instrText>
             </w:r>
             <w:r>
               <w:rPr>
@@ -2001,7 +2001,7 @@
               <w:sz w:val="24"/>
             </w:rPr>
           </w:pPr>
-          <w:hyperlink w:anchor="_Toc236486282" w:history="1">
+          <w:hyperlink w:anchor="_Toc236592931" w:history="1">
             <w:r>
               <w:rPr>
                 <w:rStyle w:val="Hyperlink"/>
@@ -2028,7 +2028,7 @@
                 <w:noProof/>
                 <w:webHidden/>
               </w:rPr>
-              <w:instrText xml:space="preserve"> PAGEREF _Toc236486282 \h </w:instrText>
+              <w:instrText xml:space="preserve"> PAGEREF _Toc236592931 \h </w:instrText>
             </w:r>
             <w:r>
               <w:rPr>
@@ -2071,7 +2071,7 @@
               <w:sz w:val="24"/>
             </w:rPr>
           </w:pPr>
-          <w:hyperlink w:anchor="_Toc236486283" w:history="1">
+          <w:hyperlink w:anchor="_Toc236592932" w:history="1">
             <w:r>
               <w:rPr>
                 <w:rStyle w:val="Hyperlink"/>
@@ -2098,7 +2098,7 @@
                 <w:noProof/>
                 <w:webHidden/>
               </w:rPr>
-              <w:instrText xml:space="preserve"> PAGEREF _Toc236486283 \h </w:instrText>
+              <w:instrText xml:space="preserve"> PAGEREF _Toc236592932 \h </w:instrText>
             </w:r>
             <w:r>
               <w:rPr>
@@ -2141,13 +2141,21 @@
               <w:sz w:val="24"/>
             </w:rPr>
           </w:pPr>
-          <w:hyperlink w:anchor="_Toc236486284" w:history="1">
+          <w:hyperlink w:anchor="_Toc236592933" w:history="1">
             <w:r>
               <w:rPr>
                 <w:rStyle w:val="Hyperlink"/>
                 <w:noProof/>
               </w:rPr>
-              <w:t>Action behavior contract</w:t>
+              <w:t>Act</w:t>
+            </w:r>
+            <w:r>
+              <w:rPr>
+                <w:rStyle w:val="Hyperlink"/>
+                <w:noProof/>
+              </w:rPr>
+              <w:lastRenderedPageBreak/>
+              <w:t>ion behavior contract</w:t>
             </w:r>
             <w:r>
               <w:rPr>
@@ -2168,7 +2176,7 @@
                 <w:noProof/>
                 <w:webHidden/>
               </w:rPr>
-              <w:instrText xml:space="preserve"> PAGEREF _Toc236486284 \h </w:instrText>
+              <w:instrText xml:space="preserve"> PAGEREF _Toc236592933 \h </w:instrText>
             </w:r>
             <w:r>
               <w:rPr>
@@ -2211,7 +2219,7 @@
               <w:sz w:val="24"/>
             </w:rPr>
           </w:pPr>
-          <w:hyperlink w:anchor="_Toc236486285" w:history="1">
+          <w:hyperlink w:anchor="_Toc236592934" w:history="1">
             <w:r>
               <w:rPr>
                 <w:rStyle w:val="Hyperlink"/>
@@ -2238,7 +2246,7 @@
                 <w:noProof/>
                 <w:webHidden/>
               </w:rPr>
-              <w:instrText xml:space="preserve"> PAGEREF _Toc236486285 \h </w:instrText>
+              <w:instrText xml:space="preserve"> PAGEREF _Toc236592934 \h </w:instrText>
             </w:r>
             <w:r>
               <w:rPr>
@@ -2281,7 +2289,7 @@
               <w:sz w:val="24"/>
             </w:rPr>
           </w:pPr>
-          <w:hyperlink w:anchor="_Toc236486286" w:history="1">
+          <w:hyperlink w:anchor="_Toc236592935" w:history="1">
             <w:r>
               <w:rPr>
                 <w:rStyle w:val="Hyperlink"/>
@@ -2308,7 +2316,7 @@
                 <w:noProof/>
                 <w:webHidden/>
               </w:rPr>
-              <w:instrText xml:space="preserve"> PAGEREF _Toc236486286 \h </w:instrText>
+              <w:instrText xml:space="preserve"> PAGEREF _Toc236592935 \h </w:instrText>
             </w:r>
             <w:r>
               <w:rPr>
@@ -2351,7 +2359,7 @@
               <w:sz w:val="24"/>
             </w:rPr>
           </w:pPr>
-          <w:hyperlink w:anchor="_Toc236486287" w:history="1">
+          <w:hyperlink w:anchor="_Toc236592936" w:history="1">
             <w:r>
               <w:rPr>
                 <w:rStyle w:val="Hyperlink"/>
@@ -2378,7 +2386,7 @@
                 <w:noProof/>
                 <w:webHidden/>
               </w:rPr>
-              <w:instrText xml:space="preserve"> PAGEREF _Toc236486287 \h </w:instrText>
+              <w:instrText xml:space="preserve"> PAGEREF _Toc236592936 \h </w:instrText>
             </w:r>
             <w:r>
               <w:rPr>
@@ -2421,7 +2429,7 @@
               <w:sz w:val="24"/>
             </w:rPr>
           </w:pPr>
-          <w:hyperlink w:anchor="_Toc236486288" w:history="1">
+          <w:hyperlink w:anchor="_Toc236592937" w:history="1">
             <w:r>
               <w:rPr>
                 <w:rStyle w:val="Hyperlink"/>
@@ -2448,7 +2456,7 @@
                 <w:noProof/>
                 <w:webHidden/>
               </w:rPr>
-              <w:instrText xml:space="preserve"> PAGEREF _Toc236486288 \h </w:instrText>
+              <w:instrText xml:space="preserve"> PAGEREF _Toc236592937 \h </w:instrText>
             </w:r>
             <w:r>
               <w:rPr>
@@ -2491,7 +2499,7 @@
               <w:sz w:val="24"/>
             </w:rPr>
           </w:pPr>
-          <w:hyperlink w:anchor="_Toc236486289" w:history="1">
+          <w:hyperlink w:anchor="_Toc236592938" w:history="1">
             <w:r>
               <w:rPr>
                 <w:rStyle w:val="Hyperlink"/>
@@ -2518,7 +2526,7 @@
                 <w:noProof/>
                 <w:webHidden/>
               </w:rPr>
-              <w:instrText xml:space="preserve"> PAGEREF _Toc236486289 \h </w:instrText>
+              <w:instrText xml:space="preserve"> PAGEREF _Toc236592938 \h </w:instrText>
             </w:r>
             <w:r>
               <w:rPr>
@@ -2561,7 +2569,7 @@
               <w:sz w:val="24"/>
             </w:rPr>
           </w:pPr>
-          <w:hyperlink w:anchor="_Toc236486290" w:history="1">
+          <w:hyperlink w:anchor="_Toc236592939" w:history="1">
             <w:r>
               <w:rPr>
                 <w:rStyle w:val="Hyperlink"/>
@@ -2588,7 +2596,7 @@
                 <w:noProof/>
                 <w:webHidden/>
               </w:rPr>
-              <w:instrText xml:space="preserve"> PAGEREF _Toc236486290 \h </w:instrText>
+              <w:instrText xml:space="preserve"> PAGEREF _Toc236592939 \h </w:instrText>
             </w:r>
             <w:r>
               <w:rPr>
@@ -2631,7 +2639,7 @@
               <w:sz w:val="24"/>
             </w:rPr>
           </w:pPr>
-          <w:hyperlink w:anchor="_Toc236486291" w:history="1">
+          <w:hyperlink w:anchor="_Toc236592940" w:history="1">
             <w:r>
               <w:rPr>
                 <w:rStyle w:val="Hyperlink"/>
@@ -2658,7 +2666,7 @@
                 <w:noProof/>
                 <w:webHidden/>
               </w:rPr>
-              <w:instrText xml:space="preserve"> PAGEREF _Toc236486291 \h </w:instrText>
+              <w:instrText xml:space="preserve"> PAGEREF _Toc236592940 \h </w:instrText>
             </w:r>
             <w:r>
               <w:rPr>
@@ -2701,7 +2709,7 @@
               <w:sz w:val="24"/>
             </w:rPr>
           </w:pPr>
-          <w:hyperlink w:anchor="_Toc236486292" w:history="1">
+          <w:hyperlink w:anchor="_Toc236592941" w:history="1">
             <w:r>
               <w:rPr>
                 <w:rStyle w:val="Hyperlink"/>
@@ -2728,7 +2736,7 @@
                 <w:noProof/>
                 <w:webHidden/>
               </w:rPr>
-              <w:instrText xml:space="preserve"> PAGEREF _Toc236486292 \h </w:instrText>
+              <w:instrText xml:space="preserve"> PAGEREF _Toc236592941 \h </w:instrText>
             </w:r>
             <w:r>
               <w:rPr>
@@ -2771,7 +2779,7 @@
               <w:sz w:val="24"/>
             </w:rPr>
           </w:pPr>
-          <w:hyperlink w:anchor="_Toc236486293" w:history="1">
+          <w:hyperlink w:anchor="_Toc236592942" w:history="1">
             <w:r>
               <w:rPr>
                 <w:rStyle w:val="Hyperlink"/>
@@ -2798,7 +2806,7 @@
                 <w:noProof/>
                 <w:webHidden/>
               </w:rPr>
-              <w:instrText xml:space="preserve"> PAGEREF _Toc236486293 \h </w:instrText>
+              <w:instrText xml:space="preserve"> PAGEREF _Toc236592942 \h </w:instrText>
             </w:r>
             <w:r>
               <w:rPr>
@@ -2841,20 +2849,13 @@
               <w:sz w:val="24"/>
             </w:rPr>
           </w:pPr>
-          <w:hyperlink w:anchor="_Toc236486294" w:history="1">
+          <w:hyperlink w:anchor="_Toc236592943" w:history="1">
             <w:r>
               <w:rPr>
                 <w:rStyle w:val="Hyperlink"/>
                 <w:noProof/>
               </w:rPr>
-              <w:t xml:space="preserve">13.1 Conversion Contract System for </w:t>
-            </w:r>
-            <w:r>
-              <w:rPr>
-                <w:rStyle w:val="Hyperlink"/>
-                <w:noProof/>
-              </w:rPr>
-              <w:t>v6.0</w:t>
+              <w:t>13.1 Conversion Contract System for v6.0</w:t>
             </w:r>
             <w:r>
               <w:rPr>
@@ -2875,7 +2876,7 @@
                 <w:noProof/>
                 <w:webHidden/>
               </w:rPr>
-              <w:instrText xml:space="preserve"> PAGEREF _Toc236486294 \h </w:instrText>
+              <w:instrText xml:space="preserve"> PAGEREF _Toc236592943 \h </w:instrText>
             </w:r>
             <w:r>
               <w:rPr>
@@ -2918,7 +2919,7 @@
               <w:sz w:val="24"/>
             </w:rPr>
           </w:pPr>
-          <w:hyperlink w:anchor="_Toc236486295" w:history="1">
+          <w:hyperlink w:anchor="_Toc236592944" w:history="1">
             <w:r>
               <w:rPr>
                 <w:rStyle w:val="Hyperlink"/>
@@ -2945,7 +2946,7 @@
                 <w:noProof/>
                 <w:webHidden/>
               </w:rPr>
-              <w:instrText xml:space="preserve"> PAGEREF _Toc236486295 \h </w:instrText>
+              <w:instrText xml:space="preserve"> PAGEREF _Toc236592944 \h </w:instrText>
             </w:r>
             <w:r>
               <w:rPr>
@@ -2988,7 +2989,7 @@
               <w:sz w:val="24"/>
             </w:rPr>
           </w:pPr>
-          <w:hyperlink w:anchor="_Toc236486296" w:history="1">
+          <w:hyperlink w:anchor="_Toc236592945" w:history="1">
             <w:r>
               <w:rPr>
                 <w:rStyle w:val="Hyperlink"/>
@@ -3015,7 +3016,7 @@
                 <w:noProof/>
                 <w:webHidden/>
               </w:rPr>
-              <w:instrText xml:space="preserve"> PAGEREF _Toc236486296 \h </w:instrText>
+              <w:instrText xml:space="preserve"> PAGEREF _Toc236592945 \h </w:instrText>
             </w:r>
             <w:r>
               <w:rPr>
@@ -3058,7 +3059,7 @@
               <w:sz w:val="24"/>
             </w:rPr>
           </w:pPr>
-          <w:hyperlink w:anchor="_Toc236486297" w:history="1">
+          <w:hyperlink w:anchor="_Toc236592946" w:history="1">
             <w:r>
               <w:rPr>
                 <w:rStyle w:val="Hyperlink"/>
@@ -3085,7 +3086,7 @@
                 <w:noProof/>
                 <w:webHidden/>
               </w:rPr>
-              <w:instrText xml:space="preserve"> PAGEREF _Toc236486297 \h </w:instrText>
+              <w:instrText xml:space="preserve"> PAGEREF _Toc236592946 \h </w:instrText>
             </w:r>
             <w:r>
               <w:rPr>
@@ -3128,7 +3129,7 @@
               <w:sz w:val="24"/>
             </w:rPr>
           </w:pPr>
-          <w:hyperlink w:anchor="_Toc236486298" w:history="1">
+          <w:hyperlink w:anchor="_Toc236592947" w:history="1">
             <w:r>
               <w:rPr>
                 <w:rStyle w:val="Hyperlink"/>
@@ -3155,7 +3156,7 @@
                 <w:noProof/>
                 <w:webHidden/>
               </w:rPr>
-              <w:instrText xml:space="preserve"> PAGEREF _Toc236486298 \h </w:instrText>
+              <w:instrText xml:space="preserve"> PAGEREF _Toc236592947 \h </w:instrText>
             </w:r>
             <w:r>
               <w:rPr>
@@ -3198,7 +3199,7 @@
               <w:sz w:val="24"/>
             </w:rPr>
           </w:pPr>
-          <w:hyperlink w:anchor="_Toc236486299" w:history="1">
+          <w:hyperlink w:anchor="_Toc236592948" w:history="1">
             <w:r>
               <w:rPr>
                 <w:rStyle w:val="Hyperlink"/>
@@ -3225,7 +3226,7 @@
                 <w:noProof/>
                 <w:webHidden/>
               </w:rPr>
-              <w:instrText xml:space="preserve"> PAGEREF _Toc236486299 \h </w:instrText>
+              <w:instrText xml:space="preserve"> PAGEREF _Toc236592948 \h </w:instrText>
             </w:r>
             <w:r>
               <w:rPr>
@@ -3268,7 +3269,7 @@
               <w:sz w:val="24"/>
             </w:rPr>
           </w:pPr>
-          <w:hyperlink w:anchor="_Toc236486300" w:history="1">
+          <w:hyperlink w:anchor="_Toc236592949" w:history="1">
             <w:r>
               <w:rPr>
                 <w:rStyle w:val="Hyperlink"/>
@@ -3295,7 +3296,7 @@
                 <w:noProof/>
                 <w:webHidden/>
               </w:rPr>
-              <w:instrText xml:space="preserve"> PAGEREF _Toc236486300 \h </w:instrText>
+              <w:instrText xml:space="preserve"> PAGEREF _Toc236592949 \h </w:instrText>
             </w:r>
             <w:r>
               <w:rPr>
@@ -3338,7 +3339,7 @@
               <w:sz w:val="24"/>
             </w:rPr>
           </w:pPr>
-          <w:hyperlink w:anchor="_Toc236486301" w:history="1">
+          <w:hyperlink w:anchor="_Toc236592950" w:history="1">
             <w:r>
               <w:rPr>
                 <w:rStyle w:val="Hyperlink"/>
@@ -3365,7 +3366,7 @@
                 <w:noProof/>
                 <w:webHidden/>
               </w:rPr>
-              <w:instrText xml:space="preserve"> PAGEREF _Toc236486301 \h </w:instrText>
+              <w:instrText xml:space="preserve"> PAGEREF _Toc236592950 \h </w:instrText>
             </w:r>
             <w:r>
               <w:rPr>
@@ -3408,7 +3409,7 @@
               <w:sz w:val="24"/>
             </w:rPr>
           </w:pPr>
-          <w:hyperlink w:anchor="_Toc236486302" w:history="1">
+          <w:hyperlink w:anchor="_Toc236592951" w:history="1">
             <w:r>
               <w:rPr>
                 <w:rStyle w:val="Hyperlink"/>
@@ -3435,7 +3436,7 @@
                 <w:noProof/>
                 <w:webHidden/>
               </w:rPr>
-              <w:instrText xml:space="preserve"> PAGEREF _Toc236486302 \h </w:instrText>
+              <w:instrText xml:space="preserve"> PAGEREF _Toc236592951 \h </w:instrText>
             </w:r>
             <w:r>
               <w:rPr>
@@ -3478,7 +3479,7 @@
               <w:sz w:val="24"/>
             </w:rPr>
           </w:pPr>
-          <w:hyperlink w:anchor="_Toc236486303" w:history="1">
+          <w:hyperlink w:anchor="_Toc236592952" w:history="1">
             <w:r>
               <w:rPr>
                 <w:rStyle w:val="Hyperlink"/>
@@ -3505,7 +3506,7 @@
                 <w:noProof/>
                 <w:webHidden/>
               </w:rPr>
-              <w:instrText xml:space="preserve"> PAGEREF _Toc236486303 \h </w:instrText>
+              <w:instrText xml:space="preserve"> PAGEREF _Toc236592952 \h </w:instrText>
             </w:r>
             <w:r>
               <w:rPr>
@@ -3548,7 +3549,7 @@
               <w:sz w:val="24"/>
             </w:rPr>
           </w:pPr>
-          <w:hyperlink w:anchor="_Toc236486304" w:history="1">
+          <w:hyperlink w:anchor="_Toc236592953" w:history="1">
             <w:r>
               <w:rPr>
                 <w:rStyle w:val="Hyperlink"/>
@@ -3575,7 +3576,7 @@
                 <w:noProof/>
                 <w:webHidden/>
               </w:rPr>
-              <w:instrText xml:space="preserve"> PAGEREF _Toc236486304 \h </w:instrText>
+              <w:instrText xml:space="preserve"> PAGEREF _Toc236592953 \h </w:instrText>
             </w:r>
             <w:r>
               <w:rPr>
@@ -3618,7 +3619,7 @@
               <w:sz w:val="24"/>
             </w:rPr>
           </w:pPr>
-          <w:hyperlink w:anchor="_Toc236486305" w:history="1">
+          <w:hyperlink w:anchor="_Toc236592954" w:history="1">
             <w:r>
               <w:rPr>
                 <w:rStyle w:val="Hyperlink"/>
@@ -3645,7 +3646,7 @@
                 <w:noProof/>
                 <w:webHidden/>
               </w:rPr>
-              <w:instrText xml:space="preserve"> PAGEREF _Toc236486305 \h </w:instrText>
+              <w:instrText xml:space="preserve"> PAGEREF _Toc236592954 \h </w:instrText>
             </w:r>
             <w:r>
               <w:rPr>
@@ -3688,7 +3689,7 @@
               <w:sz w:val="24"/>
             </w:rPr>
           </w:pPr>
-          <w:hyperlink w:anchor="_Toc236486306" w:history="1">
+          <w:hyperlink w:anchor="_Toc236592955" w:history="1">
             <w:r>
               <w:rPr>
                 <w:rStyle w:val="Hyperlink"/>
@@ -3715,7 +3716,7 @@
                 <w:noProof/>
                 <w:webHidden/>
               </w:rPr>
-              <w:instrText xml:space="preserve"> PAGEREF _Toc236486306 \h </w:instrText>
+              <w:instrText xml:space="preserve"> PAGEREF _Toc236592955 \h </w:instrText>
             </w:r>
             <w:r>
               <w:rPr>
@@ -3758,7 +3759,7 @@
               <w:sz w:val="24"/>
             </w:rPr>
           </w:pPr>
-          <w:hyperlink w:anchor="_Toc236486307" w:history="1">
+          <w:hyperlink w:anchor="_Toc236592956" w:history="1">
             <w:r>
               <w:rPr>
                 <w:rStyle w:val="Hyperlink"/>
@@ -3785,7 +3786,7 @@
                 <w:noProof/>
                 <w:webHidden/>
               </w:rPr>
-              <w:instrText xml:space="preserve"> PAGEREF _Toc236486307 \h </w:instrText>
+              <w:instrText xml:space="preserve"> PAGEREF _Toc236592956 \h </w:instrText>
             </w:r>
             <w:r>
               <w:rPr>
@@ -3828,7 +3829,7 @@
               <w:sz w:val="24"/>
             </w:rPr>
           </w:pPr>
-          <w:hyperlink w:anchor="_Toc236486308" w:history="1">
+          <w:hyperlink w:anchor="_Toc236592957" w:history="1">
             <w:r>
               <w:rPr>
                 <w:rStyle w:val="Hyperlink"/>
@@ -3855,7 +3856,7 @@
                 <w:noProof/>
                 <w:webHidden/>
               </w:rPr>
-              <w:instrText xml:space="preserve"> PAGEREF _Toc236486308 \h </w:instrText>
+              <w:instrText xml:space="preserve"> PAGEREF _Toc236592957 \h </w:instrText>
             </w:r>
             <w:r>
               <w:rPr>
@@ -3898,7 +3899,7 @@
               <w:sz w:val="24"/>
             </w:rPr>
           </w:pPr>
-          <w:hyperlink w:anchor="_Toc236486309" w:history="1">
+          <w:hyperlink w:anchor="_Toc236592958" w:history="1">
             <w:r>
               <w:rPr>
                 <w:rStyle w:val="Hyperlink"/>
@@ -3925,7 +3926,7 @@
                 <w:noProof/>
                 <w:webHidden/>
               </w:rPr>
-              <w:instrText xml:space="preserve"> PAGEREF _Toc236486309 \h </w:instrText>
+              <w:instrText xml:space="preserve"> PAGEREF _Toc236592958 \h </w:instrText>
             </w:r>
             <w:r>
               <w:rPr>
@@ -3968,7 +3969,7 @@
               <w:sz w:val="24"/>
             </w:rPr>
           </w:pPr>
-          <w:hyperlink w:anchor="_Toc236486310" w:history="1">
+          <w:hyperlink w:anchor="_Toc236592959" w:history="1">
             <w:r>
               <w:rPr>
                 <w:rStyle w:val="Hyperlink"/>
@@ -3995,7 +3996,7 @@
                 <w:noProof/>
                 <w:webHidden/>
               </w:rPr>
-              <w:instrText xml:space="preserve"> PAGEREF _Toc236486310 \h </w:instrText>
+              <w:instrText xml:space="preserve"> PAGEREF _Toc236592959 \h </w:instrText>
             </w:r>
             <w:r>
               <w:rPr>
@@ -4038,7 +4039,7 @@
               <w:sz w:val="24"/>
             </w:rPr>
           </w:pPr>
-          <w:hyperlink w:anchor="_Toc236486311" w:history="1">
+          <w:hyperlink w:anchor="_Toc236592960" w:history="1">
             <w:r>
               <w:rPr>
                 <w:rStyle w:val="Hyperlink"/>
@@ -4066,7 +4067,7 @@
                 <w:noProof/>
                 <w:webHidden/>
               </w:rPr>
-              <w:instrText xml:space="preserve"> PAGEREF _Toc236486311 \h </w:instrText>
+              <w:instrText xml:space="preserve"> PAGEREF _Toc236592960 \h </w:instrText>
             </w:r>
             <w:r>
               <w:rPr>
@@ -4109,7 +4110,7 @@
               <w:sz w:val="24"/>
             </w:rPr>
           </w:pPr>
-          <w:hyperlink w:anchor="_Toc236486312" w:history="1">
+          <w:hyperlink w:anchor="_Toc236592961" w:history="1">
             <w:r>
               <w:rPr>
                 <w:rStyle w:val="Hyperlink"/>
@@ -4137,7 +4138,7 @@
                 <w:noProof/>
                 <w:webHidden/>
               </w:rPr>
-              <w:instrText xml:space="preserve"> PAGEREF _Toc236486312 \h </w:instrText>
+              <w:instrText xml:space="preserve"> PAGEREF _Toc236592961 \h </w:instrText>
             </w:r>
             <w:r>
               <w:rPr>
@@ -4180,7 +4181,7 @@
               <w:sz w:val="24"/>
             </w:rPr>
           </w:pPr>
-          <w:hyperlink w:anchor="_Toc236486313" w:history="1">
+          <w:hyperlink w:anchor="_Toc236592962" w:history="1">
             <w:r>
               <w:rPr>
                 <w:rStyle w:val="Hyperlink"/>
@@ -4208,7 +4209,7 @@
                 <w:noProof/>
                 <w:webHidden/>
               </w:rPr>
-              <w:instrText xml:space="preserve"> PAGEREF _Toc236486313 \h </w:instrText>
+              <w:instrText xml:space="preserve"> PAGEREF _Toc236592962 \h </w:instrText>
             </w:r>
             <w:r>
               <w:rPr>
@@ -4251,7 +4252,7 @@
               <w:sz w:val="24"/>
             </w:rPr>
           </w:pPr>
-          <w:hyperlink w:anchor="_Toc236486314" w:history="1">
+          <w:hyperlink w:anchor="_Toc236592963" w:history="1">
             <w:r>
               <w:rPr>
                 <w:rStyle w:val="Hyperlink"/>
@@ -4278,7 +4279,7 @@
                 <w:noProof/>
                 <w:webHidden/>
               </w:rPr>
-              <w:instrText xml:space="preserve"> PAGEREF _Toc236486314 \h </w:instrText>
+              <w:instrText xml:space="preserve"> PAGEREF _Toc236592963 \h </w:instrText>
             </w:r>
             <w:r>
               <w:rPr>
@@ -4321,7 +4322,7 @@
               <w:sz w:val="24"/>
             </w:rPr>
           </w:pPr>
-          <w:hyperlink w:anchor="_Toc236486315" w:history="1">
+          <w:hyperlink w:anchor="_Toc236592964" w:history="1">
             <w:r>
               <w:rPr>
                 <w:rStyle w:val="Hyperlink"/>
@@ -4348,7 +4349,7 @@
                 <w:noProof/>
                 <w:webHidden/>
               </w:rPr>
-              <w:instrText xml:space="preserve"> PAGEREF _Toc236486315 \h </w:instrText>
+              <w:instrText xml:space="preserve"> PAGEREF _Toc236592964 \h </w:instrText>
             </w:r>
             <w:r>
               <w:rPr>
@@ -4391,7 +4392,7 @@
               <w:sz w:val="24"/>
             </w:rPr>
           </w:pPr>
-          <w:hyperlink w:anchor="_Toc236486316" w:history="1">
+          <w:hyperlink w:anchor="_Toc236592965" w:history="1">
             <w:r>
               <w:rPr>
                 <w:rStyle w:val="Hyperlink"/>
@@ -4418,7 +4419,7 @@
                 <w:noProof/>
                 <w:webHidden/>
               </w:rPr>
-              <w:instrText xml:space="preserve"> PAGEREF _Toc236486316 \h </w:instrText>
+              <w:instrText xml:space="preserve"> PAGEREF _Toc236592965 \h </w:instrText>
             </w:r>
             <w:r>
               <w:rPr>
@@ -4461,7 +4462,7 @@
               <w:sz w:val="24"/>
             </w:rPr>
           </w:pPr>
-          <w:hyperlink w:anchor="_Toc236486317" w:history="1">
+          <w:hyperlink w:anchor="_Toc236592966" w:history="1">
             <w:r>
               <w:rPr>
                 <w:rStyle w:val="Hyperlink"/>
@@ -4489,7 +4490,7 @@
                 <w:noProof/>
                 <w:webHidden/>
               </w:rPr>
-              <w:instrText xml:space="preserve"> PAGEREF _Toc236486317 \h </w:instrText>
+              <w:instrText xml:space="preserve"> PAGEREF _Toc236592966 \h </w:instrText>
             </w:r>
             <w:r>
               <w:rPr>
@@ -4532,7 +4533,7 @@
               <w:sz w:val="24"/>
             </w:rPr>
           </w:pPr>
-          <w:hyperlink w:anchor="_Toc236486318" w:history="1">
+          <w:hyperlink w:anchor="_Toc236592967" w:history="1">
             <w:r>
               <w:rPr>
                 <w:rStyle w:val="Hyperlink"/>
@@ -4560,7 +4561,7 @@
                 <w:noProof/>
                 <w:webHidden/>
               </w:rPr>
-              <w:instrText xml:space="preserve"> PAGEREF _Toc236486318 \h </w:instrText>
+              <w:instrText xml:space="preserve"> PAGEREF _Toc236592967 \h </w:instrText>
             </w:r>
             <w:r>
               <w:rPr>
@@ -4603,7 +4604,7 @@
               <w:sz w:val="24"/>
             </w:rPr>
           </w:pPr>
-          <w:hyperlink w:anchor="_Toc236486319" w:history="1">
+          <w:hyperlink w:anchor="_Toc236592968" w:history="1">
             <w:r>
               <w:rPr>
                 <w:rStyle w:val="Hyperlink"/>
@@ -4631,7 +4632,7 @@
                 <w:noProof/>
                 <w:webHidden/>
               </w:rPr>
-              <w:instrText xml:space="preserve"> PAGEREF _Toc236486319 \h </w:instrText>
+              <w:instrText xml:space="preserve"> PAGEREF _Toc236592968 \h </w:instrText>
             </w:r>
             <w:r>
               <w:rPr>
@@ -4674,20 +4675,13 @@
               <w:sz w:val="24"/>
             </w:rPr>
           </w:pPr>
-          <w:hyperlink w:anchor="_Toc236486320" w:history="1">
+          <w:hyperlink w:anchor="_Toc236592969" w:history="1">
             <w:r>
               <w:rPr>
                 <w:rStyle w:val="Hyperlink"/>
                 <w:noProof/>
               </w:rPr>
-              <w:t xml:space="preserve">15.6  Files Modified in </w:t>
-            </w:r>
-            <w:r>
-              <w:rPr>
-                <w:rStyle w:val="Hyperlink"/>
-                <w:noProof/>
-              </w:rPr>
-              <w:t>v6.0</w:t>
+              <w:t>15.6  Files Modified in v6.0</w:t>
             </w:r>
             <w:r>
               <w:rPr>
@@ -4708,7 +4702,7 @@
                 <w:noProof/>
                 <w:webHidden/>
               </w:rPr>
-              <w:instrText xml:space="preserve"> PAGEREF _Toc236486320 \h </w:instrText>
+              <w:instrText xml:space="preserve"> PAGEREF _Toc236592969 \h </w:instrText>
             </w:r>
             <w:r>
               <w:rPr>
@@ -4751,7 +4745,7 @@
               <w:sz w:val="24"/>
             </w:rPr>
           </w:pPr>
-          <w:hyperlink w:anchor="_Toc236486321" w:history="1">
+          <w:hyperlink w:anchor="_Toc236592970" w:history="1">
             <w:r>
               <w:rPr>
                 <w:rStyle w:val="Hyperlink"/>
@@ -4778,7 +4772,7 @@
                 <w:noProof/>
                 <w:webHidden/>
               </w:rPr>
-              <w:instrText xml:space="preserve"> PAGEREF _Toc236486321 \h </w:instrText>
+              <w:instrText xml:space="preserve"> PAGEREF _Toc236592970 \h </w:instrText>
             </w:r>
             <w:r>
               <w:rPr>
@@ -4821,7 +4815,7 @@
               <w:sz w:val="24"/>
             </w:rPr>
           </w:pPr>
-          <w:hyperlink w:anchor="_Toc236486322" w:history="1">
+          <w:hyperlink w:anchor="_Toc236592971" w:history="1">
             <w:r>
               <w:rPr>
                 <w:rStyle w:val="Hyperlink"/>
@@ -4848,7 +4842,7 @@
                 <w:noProof/>
                 <w:webHidden/>
               </w:rPr>
-              <w:instrText xml:space="preserve"> PAGEREF _Toc236486322 \h </w:instrText>
+              <w:instrText xml:space="preserve"> PAGEREF _Toc236592971 \h </w:instrText>
             </w:r>
             <w:r>
               <w:rPr>
@@ -4891,7 +4885,7 @@
               <w:sz w:val="24"/>
             </w:rPr>
           </w:pPr>
-          <w:hyperlink w:anchor="_Toc236486323" w:history="1">
+          <w:hyperlink w:anchor="_Toc236592972" w:history="1">
             <w:r>
               <w:rPr>
                 <w:rStyle w:val="Hyperlink"/>
@@ -4918,7 +4912,7 @@
                 <w:noProof/>
                 <w:webHidden/>
               </w:rPr>
-              <w:instrText xml:space="preserve"> PAGEREF _Toc236486323 \h </w:instrText>
+              <w:instrText xml:space="preserve"> PAGEREF _Toc236592972 \h </w:instrText>
             </w:r>
             <w:r>
               <w:rPr>
@@ -4961,7 +4955,7 @@
               <w:sz w:val="24"/>
             </w:rPr>
           </w:pPr>
-          <w:hyperlink w:anchor="_Toc236486324" w:history="1">
+          <w:hyperlink w:anchor="_Toc236592973" w:history="1">
             <w:r>
               <w:rPr>
                 <w:rStyle w:val="Hyperlink"/>
@@ -4988,7 +4982,7 @@
                 <w:noProof/>
                 <w:webHidden/>
               </w:rPr>
-              <w:instrText xml:space="preserve"> PAGEREF _Toc236486324 \h </w:instrText>
+              <w:instrText xml:space="preserve"> PAGEREF _Toc236592973 \h </w:instrText>
             </w:r>
             <w:r>
               <w:rPr>
@@ -5031,7 +5025,7 @@
               <w:sz w:val="24"/>
             </w:rPr>
           </w:pPr>
-          <w:hyperlink w:anchor="_Toc236486325" w:history="1">
+          <w:hyperlink w:anchor="_Toc236592974" w:history="1">
             <w:r>
               <w:rPr>
                 <w:rStyle w:val="Hyperlink"/>
@@ -5058,7 +5052,7 @@
                 <w:noProof/>
                 <w:webHidden/>
               </w:rPr>
-              <w:instrText xml:space="preserve"> PAGEREF _Toc236486325 \h </w:instrText>
+              <w:instrText xml:space="preserve"> PAGEREF _Toc236592974 \h </w:instrText>
             </w:r>
             <w:r>
               <w:rPr>
@@ -5101,7 +5095,7 @@
               <w:sz w:val="24"/>
             </w:rPr>
           </w:pPr>
-          <w:hyperlink w:anchor="_Toc236486326" w:history="1">
+          <w:hyperlink w:anchor="_Toc236592975" w:history="1">
             <w:r>
               <w:rPr>
                 <w:rStyle w:val="Hyperlink"/>
@@ -5128,7 +5122,7 @@
                 <w:noProof/>
                 <w:webHidden/>
               </w:rPr>
-              <w:instrText xml:space="preserve"> PAGEREF _Toc236486326 \h </w:instrText>
+              <w:instrText xml:space="preserve"> PAGEREF _Toc236592975 \h </w:instrText>
             </w:r>
             <w:r>
               <w:rPr>
@@ -5171,7 +5165,7 @@
               <w:sz w:val="24"/>
             </w:rPr>
           </w:pPr>
-          <w:hyperlink w:anchor="_Toc236486327" w:history="1">
+          <w:hyperlink w:anchor="_Toc236592976" w:history="1">
             <w:r>
               <w:rPr>
                 <w:rStyle w:val="Hyperlink"/>
@@ -5198,7 +5192,7 @@
                 <w:noProof/>
                 <w:webHidden/>
               </w:rPr>
-              <w:instrText xml:space="preserve"> PAGEREF _Toc236486327 \h </w:instrText>
+              <w:instrText xml:space="preserve"> PAGEREF _Toc236592976 \h </w:instrText>
             </w:r>
             <w:r>
               <w:rPr>
@@ -5241,7 +5235,7 @@
               <w:sz w:val="24"/>
             </w:rPr>
           </w:pPr>
-          <w:hyperlink w:anchor="_Toc236486328" w:history="1">
+          <w:hyperlink w:anchor="_Toc236592977" w:history="1">
             <w:r>
               <w:rPr>
                 <w:rStyle w:val="Hyperlink"/>
@@ -5268,7 +5262,7 @@
                 <w:noProof/>
                 <w:webHidden/>
               </w:rPr>
-              <w:instrText xml:space="preserve"> PAGEREF _Toc236486328 \h </w:instrText>
+              <w:instrText xml:space="preserve"> PAGEREF _Toc236592977 \h </w:instrText>
             </w:r>
             <w:r>
               <w:rPr>
@@ -5311,7 +5305,7 @@
               <w:sz w:val="24"/>
             </w:rPr>
           </w:pPr>
-          <w:hyperlink w:anchor="_Toc236486329" w:history="1">
+          <w:hyperlink w:anchor="_Toc236592978" w:history="1">
             <w:r>
               <w:rPr>
                 <w:rStyle w:val="Hyperlink"/>
@@ -5338,7 +5332,7 @@
                 <w:noProof/>
                 <w:webHidden/>
               </w:rPr>
-              <w:instrText xml:space="preserve"> PAGEREF _Toc236486329 \h </w:instrText>
+              <w:instrText xml:space="preserve"> PAGEREF _Toc236592978 \h </w:instrText>
             </w:r>
             <w:r>
               <w:rPr>
@@ -5381,7 +5375,7 @@
               <w:sz w:val="24"/>
             </w:rPr>
           </w:pPr>
-          <w:hyperlink w:anchor="_Toc236486330" w:history="1">
+          <w:hyperlink w:anchor="_Toc236592979" w:history="1">
             <w:r>
               <w:rPr>
                 <w:rStyle w:val="Hyperlink"/>
@@ -5409,7 +5403,7 @@
                 <w:noProof/>
                 <w:webHidden/>
               </w:rPr>
-              <w:instrText xml:space="preserve"> PAGEREF _Toc236486330 \h </w:instrText>
+              <w:instrText xml:space="preserve"> PAGEREF _Toc236592979 \h </w:instrText>
             </w:r>
             <w:r>
               <w:rPr>
@@ -5452,7 +5446,7 @@
               <w:sz w:val="24"/>
             </w:rPr>
           </w:pPr>
-          <w:hyperlink w:anchor="_Toc236486331" w:history="1">
+          <w:hyperlink w:anchor="_Toc236592980" w:history="1">
             <w:r>
               <w:rPr>
                 <w:rStyle w:val="Hyperlink"/>
@@ -5479,7 +5473,7 @@
                 <w:noProof/>
                 <w:webHidden/>
               </w:rPr>
-              <w:instrText xml:space="preserve"> PAGEREF _Toc236486331 \h </w:instrText>
+              <w:instrText xml:space="preserve"> PAGEREF _Toc236592980 \h </w:instrText>
             </w:r>
             <w:r>
               <w:rPr>
@@ -5522,7 +5516,7 @@
               <w:sz w:val="24"/>
             </w:rPr>
           </w:pPr>
-          <w:hyperlink w:anchor="_Toc236486332" w:history="1">
+          <w:hyperlink w:anchor="_Toc236592981" w:history="1">
             <w:r>
               <w:rPr>
                 <w:rStyle w:val="Hyperlink"/>
@@ -5549,7 +5543,7 @@
                 <w:noProof/>
                 <w:webHidden/>
               </w:rPr>
-              <w:instrText xml:space="preserve"> PAGEREF _Toc236486332 \h </w:instrText>
+              <w:instrText xml:space="preserve"> PAGEREF _Toc236592981 \h </w:instrText>
             </w:r>
             <w:r>
               <w:rPr>
@@ -5592,7 +5586,7 @@
               <w:sz w:val="24"/>
             </w:rPr>
           </w:pPr>
-          <w:hyperlink w:anchor="_Toc236486333" w:history="1">
+          <w:hyperlink w:anchor="_Toc236592982" w:history="1">
             <w:r>
               <w:rPr>
                 <w:rStyle w:val="Hyperlink"/>
@@ -5619,7 +5613,7 @@
                 <w:noProof/>
                 <w:webHidden/>
               </w:rPr>
-              <w:instrText xml:space="preserve"> PAGEREF _Toc236486333 \h </w:instrText>
+              <w:instrText xml:space="preserve"> PAGEREF _Toc236592982 \h </w:instrText>
             </w:r>
             <w:r>
               <w:rPr>
@@ -5662,7 +5656,7 @@
               <w:sz w:val="24"/>
             </w:rPr>
           </w:pPr>
-          <w:hyperlink w:anchor="_Toc236486334" w:history="1">
+          <w:hyperlink w:anchor="_Toc236592983" w:history="1">
             <w:r>
               <w:rPr>
                 <w:rStyle w:val="Hyperlink"/>
@@ -5689,7 +5683,7 @@
                 <w:noProof/>
                 <w:webHidden/>
               </w:rPr>
-              <w:instrText xml:space="preserve"> PAGEREF _Toc236486334 \h </w:instrText>
+              <w:instrText xml:space="preserve"> PAGEREF _Toc236592983 \h </w:instrText>
             </w:r>
             <w:r>
               <w:rPr>
@@ -5732,7 +5726,7 @@
               <w:sz w:val="24"/>
             </w:rPr>
           </w:pPr>
-          <w:hyperlink w:anchor="_Toc236486335" w:history="1">
+          <w:hyperlink w:anchor="_Toc236592984" w:history="1">
             <w:r>
               <w:rPr>
                 <w:rStyle w:val="Hyperlink"/>
@@ -5759,7 +5753,7 @@
                 <w:noProof/>
                 <w:webHidden/>
               </w:rPr>
-              <w:instrText xml:space="preserve"> PAGEREF _Toc236486335 \h </w:instrText>
+              <w:instrText xml:space="preserve"> PAGEREF _Toc236592984 \h </w:instrText>
             </w:r>
             <w:r>
               <w:rPr>
@@ -5802,7 +5796,7 @@
               <w:sz w:val="24"/>
             </w:rPr>
           </w:pPr>
-          <w:hyperlink w:anchor="_Toc236486336" w:history="1">
+          <w:hyperlink w:anchor="_Toc236592985" w:history="1">
             <w:r>
               <w:rPr>
                 <w:rStyle w:val="Hyperlink"/>
@@ -5829,7 +5823,7 @@
                 <w:noProof/>
                 <w:webHidden/>
               </w:rPr>
-              <w:instrText xml:space="preserve"> PAGEREF _Toc236486336 \h </w:instrText>
+              <w:instrText xml:space="preserve"> PAGEREF _Toc236592985 \h </w:instrText>
             </w:r>
             <w:r>
               <w:rPr>
@@ -5872,7 +5866,7 @@
               <w:sz w:val="24"/>
             </w:rPr>
           </w:pPr>
-          <w:hyperlink w:anchor="_Toc236486337" w:history="1">
+          <w:hyperlink w:anchor="_Toc236592986" w:history="1">
             <w:r>
               <w:rPr>
                 <w:rStyle w:val="Hyperlink"/>
@@ -5899,7 +5893,7 @@
                 <w:noProof/>
                 <w:webHidden/>
               </w:rPr>
-              <w:instrText xml:space="preserve"> PAGEREF _Toc236486337 \h </w:instrText>
+              <w:instrText xml:space="preserve"> PAGEREF _Toc236592986 \h </w:instrText>
             </w:r>
             <w:r>
               <w:rPr>
@@ -5942,7 +5936,7 @@
               <w:sz w:val="24"/>
             </w:rPr>
           </w:pPr>
-          <w:hyperlink w:anchor="_Toc236486338" w:history="1">
+          <w:hyperlink w:anchor="_Toc236592987" w:history="1">
             <w:r>
               <w:rPr>
                 <w:rStyle w:val="Hyperlink"/>
@@ -5969,7 +5963,7 @@
                 <w:noProof/>
                 <w:webHidden/>
               </w:rPr>
-              <w:instrText xml:space="preserve"> PAGEREF _Toc236486338 \h </w:instrText>
+              <w:instrText xml:space="preserve"> PAGEREF _Toc236592987 \h </w:instrText>
             </w:r>
             <w:r>
               <w:rPr>
@@ -6012,7 +6006,7 @@
               <w:sz w:val="24"/>
             </w:rPr>
           </w:pPr>
-          <w:hyperlink w:anchor="_Toc236486339" w:history="1">
+          <w:hyperlink w:anchor="_Toc236592988" w:history="1">
             <w:r>
               <w:rPr>
                 <w:rStyle w:val="Hyperlink"/>
@@ -6039,7 +6033,7 @@
                 <w:noProof/>
                 <w:webHidden/>
               </w:rPr>
-              <w:instrText xml:space="preserve"> PAGEREF _Toc236486339 \h </w:instrText>
+              <w:instrText xml:space="preserve"> PAGEREF _Toc236592988 \h </w:instrText>
             </w:r>
             <w:r>
               <w:rPr>
@@ -6082,7 +6076,7 @@
               <w:sz w:val="24"/>
             </w:rPr>
           </w:pPr>
-          <w:hyperlink w:anchor="_Toc236486340" w:history="1">
+          <w:hyperlink w:anchor="_Toc236592989" w:history="1">
             <w:r>
               <w:rPr>
                 <w:rStyle w:val="Hyperlink"/>
@@ -6109,7 +6103,7 @@
                 <w:noProof/>
                 <w:webHidden/>
               </w:rPr>
-              <w:instrText xml:space="preserve"> PAGEREF _Toc236486340 \h </w:instrText>
+              <w:instrText xml:space="preserve"> PAGEREF _Toc236592989 \h </w:instrText>
             </w:r>
             <w:r>
               <w:rPr>
@@ -6152,7 +6146,7 @@
               <w:sz w:val="24"/>
             </w:rPr>
           </w:pPr>
-          <w:hyperlink w:anchor="_Toc236486341" w:history="1">
+          <w:hyperlink w:anchor="_Toc236592990" w:history="1">
             <w:r>
               <w:rPr>
                 <w:rStyle w:val="Hyperlink"/>
@@ -6179,7 +6173,7 @@
                 <w:noProof/>
                 <w:webHidden/>
               </w:rPr>
-              <w:instrText xml:space="preserve"> PAGEREF _Toc236486341 \h </w:instrText>
+              <w:instrText xml:space="preserve"> PAGEREF _Toc236592990 \h </w:instrText>
             </w:r>
             <w:r>
               <w:rPr>
@@ -6222,7 +6216,7 @@
               <w:sz w:val="24"/>
             </w:rPr>
           </w:pPr>
-          <w:hyperlink w:anchor="_Toc236486342" w:history="1">
+          <w:hyperlink w:anchor="_Toc236592991" w:history="1">
             <w:r>
               <w:rPr>
                 <w:rStyle w:val="Hyperlink"/>
@@ -6249,7 +6243,7 @@
                 <w:noProof/>
                 <w:webHidden/>
               </w:rPr>
-              <w:instrText xml:space="preserve"> PAGEREF _Toc236486342 \h </w:instrText>
+              <w:instrText xml:space="preserve"> PAGEREF _Toc236592991 \h </w:instrText>
             </w:r>
             <w:r>
               <w:rPr>
@@ -6292,7 +6286,7 @@
               <w:sz w:val="24"/>
             </w:rPr>
           </w:pPr>
-          <w:hyperlink w:anchor="_Toc236486343" w:history="1">
+          <w:hyperlink w:anchor="_Toc236592992" w:history="1">
             <w:r>
               <w:rPr>
                 <w:rStyle w:val="Hyperlink"/>
@@ -6319,7 +6313,7 @@
                 <w:noProof/>
                 <w:webHidden/>
               </w:rPr>
-              <w:instrText xml:space="preserve"> PAGEREF _Toc236486343 \h </w:instrText>
+              <w:instrText xml:space="preserve"> PAGEREF _Toc236592992 \h </w:instrText>
             </w:r>
             <w:r>
               <w:rPr>
@@ -6362,7 +6356,7 @@
               <w:sz w:val="24"/>
             </w:rPr>
           </w:pPr>
-          <w:hyperlink w:anchor="_Toc236486344" w:history="1">
+          <w:hyperlink w:anchor="_Toc236592993" w:history="1">
             <w:r>
               <w:rPr>
                 <w:rStyle w:val="Hyperlink"/>
@@ -6389,7 +6383,7 @@
                 <w:noProof/>
                 <w:webHidden/>
               </w:rPr>
-              <w:instrText xml:space="preserve"> PAGEREF _Toc236486344 \h </w:instrText>
+              <w:instrText xml:space="preserve"> PAGEREF _Toc236592993 \h </w:instrText>
             </w:r>
             <w:r>
               <w:rPr>
@@ -6432,20 +6426,83 @@
               <w:sz w:val="24"/>
             </w:rPr>
           </w:pPr>
-          <w:hyperlink w:anchor="_Toc236486345" w:history="1">
+          <w:hyperlink w:anchor="_Toc236592994" w:history="1">
             <w:r>
               <w:rPr>
                 <w:rStyle w:val="Hyperlink"/>
                 <w:noProof/>
               </w:rPr>
-              <w:t xml:space="preserve">Maintenance Update - </w:t>
-            </w:r>
+              <w:t>Maintenance Update - August 2, 2026</w:t>
+            </w:r>
+            <w:r>
+              <w:rPr>
+                <w:noProof/>
+                <w:webHidden/>
+              </w:rPr>
+              <w:tab/>
+            </w:r>
+            <w:r>
+              <w:rPr>
+                <w:noProof/>
+                <w:webHidden/>
+              </w:rPr>
+              <w:fldChar w:fldCharType="begin"/>
+            </w:r>
+            <w:r>
+              <w:rPr>
+                <w:noProof/>
+                <w:webHidden/>
+              </w:rPr>
+              <w:instrText xml:space="preserve"> PAGEREF _Toc236592994 \h </w:instrText>
+            </w:r>
+            <w:r>
+              <w:rPr>
+                <w:noProof/>
+                <w:webHidden/>
+              </w:rPr>
+            </w:r>
+            <w:r>
+              <w:rPr>
+                <w:noProof/>
+                <w:webHidden/>
+              </w:rPr>
+              <w:fldChar w:fldCharType="separate"/>
+            </w:r>
+            <w:r>
+              <w:rPr>
+                <w:noProof/>
+                <w:webHidden/>
+              </w:rPr>
+              <w:t>52</w:t>
+            </w:r>
+            <w:r>
+              <w:rPr>
+                <w:noProof/>
+                <w:webHidden/>
+              </w:rPr>
+              <w:fldChar w:fldCharType="end"/>
+            </w:r>
+          </w:hyperlink>
+        </w:p>
+        <w:p>
+          <w:pPr>
+            <w:pStyle w:val="TOC1"/>
+            <w:tabs>
+              <w:tab w:val="right" w:leader="dot" w:pos="10070"/>
+            </w:tabs>
+            <w:rPr>
+              <w:rFonts w:asciiTheme="minorHAnsi" w:eastAsiaTheme="minorEastAsia" w:hAnsiTheme="minorHAnsi"/>
+              <w:noProof/>
+              <w:sz w:val="24"/>
+            </w:rPr>
+          </w:pPr>
+          <w:hyperlink w:anchor="_Toc236592995" w:history="1">
             <w:r>
               <w:rPr>
                 <w:rStyle w:val="Hyperlink"/>
                 <w:noProof/>
               </w:rPr>
-              <w:t>August 2, 2026</w:t>
+              <w:t>Navigator Build 023</w:t>
             </w:r>
             <w:r>
               <w:rPr>
@@ -6466,7 +6523,7 @@
                 <w:noProof/>
                 <w:webHidden/>
               </w:rPr>
-              <w:instrText xml:space="preserve"> PAGEREF _Toc236486345 \h </w:instrText>
+              <w:instrText xml:space="preserve"> PAGEREF _Toc236592995 \h </w:instrText>
             </w:r>
             <w:r>
               <w:rPr>
@@ -6486,7 +6543,287 @@
                 <w:noProof/>
                 <w:webHidden/>
               </w:rPr>
-              <w:t>52</w:t>
+              <w:t>53</w:t>
+            </w:r>
+            <w:r>
+              <w:rPr>
+                <w:noProof/>
+                <w:webHidden/>
+              </w:rPr>
+              <w:fldChar w:fldCharType="end"/>
+            </w:r>
+          </w:hyperlink>
+        </w:p>
+        <w:p>
+          <w:pPr>
+            <w:pStyle w:val="TOC2"/>
+            <w:tabs>
+              <w:tab w:val="right" w:leader="dot" w:pos="10070"/>
+            </w:tabs>
+            <w:rPr>
+              <w:rFonts w:asciiTheme="minorHAnsi" w:eastAsiaTheme="minorEastAsia" w:hAnsiTheme="minorHAnsi"/>
+              <w:noProof/>
+              <w:sz w:val="24"/>
+            </w:rPr>
+          </w:pPr>
+          <w:hyperlink w:anchor="_Toc236592996" w:history="1">
+            <w:r>
+              <w:rPr>
+                <w:rStyle w:val="Hyperlink"/>
+                <w:noProof/>
+              </w:rPr>
+              <w:t>Architecture completed through Build 023</w:t>
+            </w:r>
+            <w:r>
+              <w:rPr>
+                <w:noProof/>
+                <w:webHidden/>
+              </w:rPr>
+              <w:tab/>
+            </w:r>
+            <w:r>
+              <w:rPr>
+                <w:noProof/>
+                <w:webHidden/>
+              </w:rPr>
+              <w:fldChar w:fldCharType="begin"/>
+            </w:r>
+            <w:r>
+              <w:rPr>
+                <w:noProof/>
+                <w:webHidden/>
+              </w:rPr>
+              <w:instrText xml:space="preserve"> PAGEREF _Toc236592996 \h </w:instrText>
+            </w:r>
+            <w:r>
+              <w:rPr>
+                <w:noProof/>
+                <w:webHidden/>
+              </w:rPr>
+            </w:r>
+            <w:r>
+              <w:rPr>
+                <w:noProof/>
+                <w:webHidden/>
+              </w:rPr>
+              <w:fldChar w:fldCharType="separate"/>
+            </w:r>
+            <w:r>
+              <w:rPr>
+                <w:noProof/>
+                <w:webHidden/>
+              </w:rPr>
+              <w:t>53</w:t>
+            </w:r>
+            <w:r>
+              <w:rPr>
+                <w:noProof/>
+                <w:webHidden/>
+              </w:rPr>
+              <w:fldChar w:fldCharType="end"/>
+            </w:r>
+          </w:hyperlink>
+        </w:p>
+        <w:p>
+          <w:pPr>
+            <w:pStyle w:val="TOC2"/>
+            <w:tabs>
+              <w:tab w:val="right" w:leader="dot" w:pos="10070"/>
+            </w:tabs>
+            <w:rPr>
+              <w:rFonts w:asciiTheme="minorHAnsi" w:eastAsiaTheme="minorEastAsia" w:hAnsiTheme="minorHAnsi"/>
+              <w:noProof/>
+              <w:sz w:val="24"/>
+            </w:rPr>
+          </w:pPr>
+          <w:hyperlink w:anchor="_Toc236592997" w:history="1">
+            <w:r>
+              <w:rPr>
+                <w:rStyle w:val="Hyperlink"/>
+                <w:noProof/>
+              </w:rPr>
+              <w:t>Mapping-pack discipline</w:t>
+            </w:r>
+            <w:r>
+              <w:rPr>
+                <w:noProof/>
+                <w:webHidden/>
+              </w:rPr>
+              <w:tab/>
+            </w:r>
+            <w:r>
+              <w:rPr>
+                <w:noProof/>
+                <w:webHidden/>
+              </w:rPr>
+              <w:fldChar w:fldCharType="begin"/>
+            </w:r>
+            <w:r>
+              <w:rPr>
+                <w:noProof/>
+                <w:webHidden/>
+              </w:rPr>
+              <w:instrText xml:space="preserve"> PAGEREF _Toc236592997 \h </w:instrText>
+            </w:r>
+            <w:r>
+              <w:rPr>
+                <w:noProof/>
+                <w:webHidden/>
+              </w:rPr>
+            </w:r>
+            <w:r>
+              <w:rPr>
+                <w:noProof/>
+                <w:webHidden/>
+              </w:rPr>
+              <w:fldChar w:fldCharType="separate"/>
+            </w:r>
+            <w:r>
+              <w:rPr>
+                <w:noProof/>
+                <w:webHidden/>
+              </w:rPr>
+              <w:t>53</w:t>
+            </w:r>
+            <w:r>
+              <w:rPr>
+                <w:noProof/>
+                <w:webHidden/>
+              </w:rPr>
+              <w:fldChar w:fldCharType="end"/>
+            </w:r>
+          </w:hyperlink>
+        </w:p>
+        <w:p>
+          <w:pPr>
+            <w:pStyle w:val="TOC2"/>
+            <w:tabs>
+              <w:tab w:val="right" w:leader="dot" w:pos="10070"/>
+            </w:tabs>
+            <w:rPr>
+              <w:rFonts w:asciiTheme="minorHAnsi" w:eastAsiaTheme="minorEastAsia" w:hAnsiTheme="minorHAnsi"/>
+              <w:noProof/>
+              <w:sz w:val="24"/>
+            </w:rPr>
+          </w:pPr>
+          <w:hyperlink w:anchor="_Toc236592998" w:history="1">
+            <w:r>
+              <w:rPr>
+                <w:rStyle w:val="Hyperlink"/>
+                <w:noProof/>
+              </w:rPr>
+              <w:t>Validation baseline</w:t>
+            </w:r>
+            <w:r>
+              <w:rPr>
+                <w:noProof/>
+                <w:webHidden/>
+              </w:rPr>
+              <w:tab/>
+            </w:r>
+            <w:r>
+              <w:rPr>
+                <w:noProof/>
+                <w:webHidden/>
+              </w:rPr>
+              <w:fldChar w:fldCharType="begin"/>
+            </w:r>
+            <w:r>
+              <w:rPr>
+                <w:noProof/>
+                <w:webHidden/>
+              </w:rPr>
+              <w:instrText xml:space="preserve"> PAGEREF _Toc236592998 \h </w:instrText>
+            </w:r>
+            <w:r>
+              <w:rPr>
+                <w:noProof/>
+                <w:webHidden/>
+              </w:rPr>
+            </w:r>
+            <w:r>
+              <w:rPr>
+                <w:noProof/>
+                <w:webHidden/>
+              </w:rPr>
+              <w:fldChar w:fldCharType="separate"/>
+            </w:r>
+            <w:r>
+              <w:rPr>
+                <w:noProof/>
+                <w:webHidden/>
+              </w:rPr>
+              <w:t>53</w:t>
+            </w:r>
+            <w:r>
+              <w:rPr>
+                <w:noProof/>
+                <w:webHidden/>
+              </w:rPr>
+              <w:fldChar w:fldCharType="end"/>
+            </w:r>
+          </w:hyperlink>
+        </w:p>
+        <w:p>
+          <w:pPr>
+            <w:pStyle w:val="TOC2"/>
+            <w:tabs>
+              <w:tab w:val="right" w:leader="dot" w:pos="10070"/>
+            </w:tabs>
+            <w:rPr>
+              <w:rFonts w:asciiTheme="minorHAnsi" w:eastAsiaTheme="minorEastAsia" w:hAnsiTheme="minorHAnsi"/>
+              <w:noProof/>
+              <w:sz w:val="24"/>
+            </w:rPr>
+          </w:pPr>
+          <w:hyperlink w:anchor="_Toc236592999" w:history="1">
+            <w:r>
+              <w:rPr>
+                <w:rStyle w:val="Hyperlink"/>
+                <w:noProof/>
+              </w:rPr>
+              <w:t>Build 023 conversion corrections</w:t>
+            </w:r>
+            <w:r>
+              <w:rPr>
+                <w:noProof/>
+                <w:webHidden/>
+              </w:rPr>
+              <w:tab/>
+            </w:r>
+            <w:r>
+              <w:rPr>
+                <w:noProof/>
+                <w:webHidden/>
+              </w:rPr>
+              <w:fldChar w:fldCharType="begin"/>
+            </w:r>
+            <w:r>
+              <w:rPr>
+                <w:noProof/>
+                <w:webHidden/>
+              </w:rPr>
+              <w:instrText xml:space="preserve"> PAGEREF _Toc236592999 \h </w:instrText>
+            </w:r>
+            <w:r>
+              <w:rPr>
+                <w:noProof/>
+                <w:webHidden/>
+              </w:rPr>
+            </w:r>
+            <w:r>
+              <w:rPr>
+                <w:noProof/>
+                <w:webHidden/>
+              </w:rPr>
+              <w:fldChar w:fldCharType="separate"/>
+            </w:r>
+            <w:r>
+              <w:rPr>
+                <w:noProof/>
+                <w:webHidden/>
+              </w:rPr>
+              <w:t>53</w:t>
             </w:r>
             <w:r>
               <w:rPr>
@@ -6517,7 +6854,7 @@
         </w:rPr>
       </w:pPr>
       <w:bookmarkStart w:id="0" w:name="_Toc225758755"/>
-      <w:bookmarkStart w:id="1" w:name="_Toc236486257"/>
+      <w:bookmarkStart w:id="1" w:name="_Toc236592906"/>
       <w:r>
         <w:rPr>
           <w:b w:val="0"/>
@@ -6550,7 +6887,7 @@
         </w:rPr>
       </w:pPr>
       <w:bookmarkStart w:id="2" w:name="_Toc225758756"/>
-      <w:bookmarkStart w:id="3" w:name="_Toc236486258"/>
+      <w:bookmarkStart w:id="3" w:name="_Toc236592907"/>
       <w:r>
         <w:rPr>
           <w:b w:val="0"/>
@@ -6605,7 +6942,7 @@
         </w:rPr>
       </w:pPr>
       <w:bookmarkStart w:id="4" w:name="_Toc225758757"/>
-      <w:bookmarkStart w:id="5" w:name="_Toc236486259"/>
+      <w:bookmarkStart w:id="5" w:name="_Toc236592908"/>
       <w:r>
         <w:rPr>
           <w:b w:val="0"/>
@@ -6868,7 +7205,7 @@
           <w:b w:val="0"/>
         </w:rPr>
       </w:pPr>
-      <w:bookmarkStart w:id="7" w:name="_Toc236486260"/>
+      <w:bookmarkStart w:id="7" w:name="_Toc236592909"/>
       <w:r>
         <w:rPr>
           <w:b w:val="0"/>
@@ -6886,7 +7223,7 @@
         </w:rPr>
       </w:pPr>
       <w:bookmarkStart w:id="8" w:name="_Toc225758759"/>
-      <w:bookmarkStart w:id="9" w:name="_Toc236486261"/>
+      <w:bookmarkStart w:id="9" w:name="_Toc236592910"/>
       <w:r>
         <w:rPr>
           <w:b w:val="0"/>
@@ -6967,7 +7304,7 @@
         </w:rPr>
       </w:pPr>
       <w:bookmarkStart w:id="10" w:name="_Toc225758760"/>
-      <w:bookmarkStart w:id="11" w:name="_Toc236486262"/>
+      <w:bookmarkStart w:id="11" w:name="_Toc236592911"/>
       <w:r>
         <w:rPr>
           <w:b w:val="0"/>
@@ -7062,7 +7399,7 @@
           <w:b w:val="0"/>
         </w:rPr>
       </w:pPr>
-      <w:bookmarkStart w:id="13" w:name="_Toc236486263"/>
+      <w:bookmarkStart w:id="13" w:name="_Toc236592912"/>
       <w:r>
         <w:rPr>
           <w:b w:val="0"/>
@@ -7085,7 +7422,7 @@
         </w:rPr>
       </w:pPr>
       <w:bookmarkStart w:id="14" w:name="_Toc225758762"/>
-      <w:bookmarkStart w:id="15" w:name="_Toc236486264"/>
+      <w:bookmarkStart w:id="15" w:name="_Toc236592913"/>
       <w:r>
         <w:rPr>
           <w:b w:val="0"/>
@@ -7482,7 +7819,7 @@
         </w:rPr>
       </w:pPr>
       <w:bookmarkStart w:id="16" w:name="_Toc225758763"/>
-      <w:bookmarkStart w:id="17" w:name="_Toc236486265"/>
+      <w:bookmarkStart w:id="17" w:name="_Toc236592914"/>
       <w:r>
         <w:rPr>
           <w:b w:val="0"/>
@@ -7908,7 +8245,7 @@
           <w:b w:val="0"/>
         </w:rPr>
       </w:pPr>
-      <w:bookmarkStart w:id="19" w:name="_Toc236486266"/>
+      <w:bookmarkStart w:id="19" w:name="_Toc236592915"/>
       <w:r>
         <w:rPr>
           <w:b w:val="0"/>
@@ -7931,7 +8268,7 @@
         </w:rPr>
       </w:pPr>
       <w:bookmarkStart w:id="20" w:name="_Toc225758765"/>
-      <w:bookmarkStart w:id="21" w:name="_Toc236486267"/>
+      <w:bookmarkStart w:id="21" w:name="_Toc236592916"/>
       <w:r>
         <w:rPr>
           <w:b w:val="0"/>
@@ -8247,7 +8584,7 @@
         </w:rPr>
       </w:pPr>
       <w:bookmarkStart w:id="22" w:name="_Toc225758766"/>
-      <w:bookmarkStart w:id="23" w:name="_Toc236486268"/>
+      <w:bookmarkStart w:id="23" w:name="_Toc236592917"/>
       <w:r>
         <w:rPr>
           <w:b w:val="0"/>
@@ -8342,7 +8679,7 @@
           <w:b w:val="0"/>
         </w:rPr>
       </w:pPr>
-      <w:bookmarkStart w:id="25" w:name="_Toc236486269"/>
+      <w:bookmarkStart w:id="25" w:name="_Toc236592918"/>
       <w:r>
         <w:rPr>
           <w:b w:val="0"/>
@@ -8365,7 +8702,7 @@
         </w:rPr>
       </w:pPr>
       <w:bookmarkStart w:id="26" w:name="_Toc225758768"/>
-      <w:bookmarkStart w:id="27" w:name="_Toc236486270"/>
+      <w:bookmarkStart w:id="27" w:name="_Toc236592919"/>
       <w:r>
         <w:rPr>
           <w:b w:val="0"/>
@@ -8444,7 +8781,7 @@
         </w:rPr>
       </w:pPr>
       <w:bookmarkStart w:id="28" w:name="_Toc225758769"/>
-      <w:bookmarkStart w:id="29" w:name="_Toc236486271"/>
+      <w:bookmarkStart w:id="29" w:name="_Toc236592920"/>
       <w:r>
         <w:rPr>
           <w:b w:val="0"/>
@@ -8505,7 +8842,7 @@
           <w:b w:val="0"/>
         </w:rPr>
       </w:pPr>
-      <w:bookmarkStart w:id="31" w:name="_Toc236486272"/>
+      <w:bookmarkStart w:id="31" w:name="_Toc236592921"/>
       <w:r>
         <w:rPr>
           <w:b w:val="0"/>
@@ -8523,7 +8860,7 @@
         </w:rPr>
       </w:pPr>
       <w:bookmarkStart w:id="32" w:name="_Toc225758771"/>
-      <w:bookmarkStart w:id="33" w:name="_Toc236486273"/>
+      <w:bookmarkStart w:id="33" w:name="_Toc236592922"/>
       <w:r>
         <w:rPr>
           <w:b w:val="0"/>
@@ -8546,7 +8883,7 @@
         </w:rPr>
       </w:pPr>
       <w:bookmarkStart w:id="34" w:name="_Toc225758772"/>
-      <w:bookmarkStart w:id="35" w:name="_Toc236486274"/>
+      <w:bookmarkStart w:id="35" w:name="_Toc236592923"/>
       <w:r>
         <w:rPr>
           <w:b w:val="0"/>
@@ -8657,7 +8994,7 @@
           <w:b w:val="0"/>
         </w:rPr>
       </w:pPr>
-      <w:bookmarkStart w:id="39" w:name="_Toc236486275"/>
+      <w:bookmarkStart w:id="39" w:name="_Toc236592924"/>
       <w:r>
         <w:rPr>
           <w:b w:val="0"/>
@@ -8675,7 +9012,7 @@
         </w:rPr>
       </w:pPr>
       <w:bookmarkStart w:id="40" w:name="_Toc225758776"/>
-      <w:bookmarkStart w:id="41" w:name="_Toc236486276"/>
+      <w:bookmarkStart w:id="41" w:name="_Toc236592925"/>
       <w:r>
         <w:rPr>
           <w:b w:val="0"/>
@@ -8698,7 +9035,7 @@
         </w:rPr>
       </w:pPr>
       <w:bookmarkStart w:id="42" w:name="_Toc225758777"/>
-      <w:bookmarkStart w:id="43" w:name="_Toc236486277"/>
+      <w:bookmarkStart w:id="43" w:name="_Toc236592926"/>
       <w:r>
         <w:rPr>
           <w:b w:val="0"/>
@@ -8721,7 +9058,7 @@
         </w:rPr>
       </w:pPr>
       <w:bookmarkStart w:id="44" w:name="_Toc225758778"/>
-      <w:bookmarkStart w:id="45" w:name="_Toc236486278"/>
+      <w:bookmarkStart w:id="45" w:name="_Toc236592927"/>
       <w:r>
         <w:rPr>
           <w:b w:val="0"/>
@@ -8971,7 +9308,7 @@
         </w:rPr>
       </w:pPr>
       <w:bookmarkStart w:id="46" w:name="_Toc225758779"/>
-      <w:bookmarkStart w:id="47" w:name="_Toc236486279"/>
+      <w:bookmarkStart w:id="47" w:name="_Toc236592928"/>
       <w:r>
         <w:rPr>
           <w:b w:val="0"/>
@@ -8989,7 +9326,7 @@
         </w:rPr>
       </w:pPr>
       <w:bookmarkStart w:id="48" w:name="_Toc225758780"/>
-      <w:bookmarkStart w:id="49" w:name="_Toc236486280"/>
+      <w:bookmarkStart w:id="49" w:name="_Toc236592929"/>
       <w:r>
         <w:rPr>
           <w:b w:val="0"/>
@@ -9012,7 +9349,7 @@
         </w:rPr>
       </w:pPr>
       <w:bookmarkStart w:id="50" w:name="_Toc225758781"/>
-      <w:bookmarkStart w:id="51" w:name="_Toc236486281"/>
+      <w:bookmarkStart w:id="51" w:name="_Toc236592930"/>
       <w:r>
         <w:rPr>
           <w:b w:val="0"/>
@@ -9128,7 +9465,7 @@
           <w:b w:val="0"/>
         </w:rPr>
       </w:pPr>
-      <w:bookmarkStart w:id="53" w:name="_Toc236486282"/>
+      <w:bookmarkStart w:id="53" w:name="_Toc236592931"/>
       <w:r>
         <w:rPr>
           <w:b w:val="0"/>
@@ -9153,7 +9490,7 @@
       <w:pPr>
         <w:pStyle w:val="Heading2"/>
       </w:pPr>
-      <w:bookmarkStart w:id="54" w:name="_Toc236486283"/>
+      <w:bookmarkStart w:id="54" w:name="_Toc236592932"/>
       <w:r>
         <w:t>9.1 Mapping-Pack Architecture and JSON Files</w:t>
       </w:r>
@@ -9183,7 +9520,7 @@
       <w:pPr>
         <w:pStyle w:val="Heading3"/>
       </w:pPr>
-      <w:bookmarkStart w:id="55" w:name="_Toc236486284"/>
+      <w:bookmarkStart w:id="55" w:name="_Toc236592933"/>
       <w:r>
         <w:t>Action behavior contract</w:t>
       </w:r>
@@ -9419,7 +9756,7 @@
       <w:pPr>
         <w:pStyle w:val="Heading3"/>
       </w:pPr>
-      <w:bookmarkStart w:id="56" w:name="_Toc236486285"/>
+      <w:bookmarkStart w:id="56" w:name="_Toc236592934"/>
       <w:r>
         <w:t>Reporting and test expectations</w:t>
       </w:r>
@@ -10573,7 +10910,7 @@
           <w:b w:val="0"/>
         </w:rPr>
       </w:pPr>
-      <w:bookmarkStart w:id="58" w:name="_Toc236486286"/>
+      <w:bookmarkStart w:id="58" w:name="_Toc236592935"/>
       <w:r>
         <w:rPr>
           <w:b w:val="0"/>
@@ -10596,7 +10933,7 @@
         </w:rPr>
       </w:pPr>
       <w:bookmarkStart w:id="59" w:name="_Toc225758784"/>
-      <w:bookmarkStart w:id="60" w:name="_Toc236486287"/>
+      <w:bookmarkStart w:id="60" w:name="_Toc236592936"/>
       <w:r>
         <w:rPr>
           <w:b w:val="0"/>
@@ -10911,7 +11248,7 @@
         </w:rPr>
       </w:pPr>
       <w:bookmarkStart w:id="61" w:name="_Toc225758785"/>
-      <w:bookmarkStart w:id="62" w:name="_Toc236486288"/>
+      <w:bookmarkStart w:id="62" w:name="_Toc236592937"/>
       <w:r>
         <w:rPr>
           <w:b w:val="0"/>
@@ -10978,7 +11315,7 @@
         </w:rPr>
       </w:pPr>
       <w:bookmarkStart w:id="63" w:name="_Toc225758786"/>
-      <w:bookmarkStart w:id="64" w:name="_Toc236486289"/>
+      <w:bookmarkStart w:id="64" w:name="_Toc236592938"/>
       <w:r>
         <w:rPr>
           <w:b w:val="0"/>
@@ -11001,7 +11338,7 @@
         </w:rPr>
       </w:pPr>
       <w:bookmarkStart w:id="65" w:name="_Toc225758787"/>
-      <w:bookmarkStart w:id="66" w:name="_Toc236486290"/>
+      <w:bookmarkStart w:id="66" w:name="_Toc236592939"/>
       <w:r>
         <w:rPr>
           <w:b w:val="0"/>
@@ -11061,7 +11398,7 @@
           <w:b w:val="0"/>
         </w:rPr>
       </w:pPr>
-      <w:bookmarkStart w:id="68" w:name="_Toc236486291"/>
+      <w:bookmarkStart w:id="68" w:name="_Toc236592940"/>
       <w:r>
         <w:rPr>
           <w:b w:val="0"/>
@@ -11127,7 +11464,7 @@
           <w:b w:val="0"/>
         </w:rPr>
       </w:pPr>
-      <w:bookmarkStart w:id="70" w:name="_Toc236486292"/>
+      <w:bookmarkStart w:id="70" w:name="_Toc236592941"/>
       <w:r>
         <w:rPr>
           <w:b w:val="0"/>
@@ -11267,7 +11604,7 @@
           <w:b w:val="0"/>
         </w:rPr>
       </w:pPr>
-      <w:bookmarkStart w:id="72" w:name="_Toc236486293"/>
+      <w:bookmarkStart w:id="72" w:name="_Toc236592942"/>
       <w:r>
         <w:rPr>
           <w:b w:val="0"/>
@@ -11623,7 +11960,7 @@
       <w:pPr>
         <w:pStyle w:val="Heading2"/>
       </w:pPr>
-      <w:bookmarkStart w:id="74" w:name="_Toc236486294"/>
+      <w:bookmarkStart w:id="74" w:name="_Toc236592943"/>
       <w:r>
         <w:t>13.1 Conversion Contract System</w:t>
       </w:r>
@@ -11726,7 +12063,7 @@
       <w:pPr>
         <w:pStyle w:val="Heading1"/>
       </w:pPr>
-      <w:bookmarkStart w:id="75" w:name="_Toc236486295"/>
+      <w:bookmarkStart w:id="75" w:name="_Toc236592944"/>
       <w:r>
         <w:t>14. Unit-by-Unit Technical Reference</w:t>
       </w:r>
@@ -11756,7 +12093,7 @@
         </w:rPr>
       </w:pPr>
       <w:bookmarkStart w:id="76" w:name="_Toc225758792"/>
-      <w:bookmarkStart w:id="77" w:name="_Toc236486296"/>
+      <w:bookmarkStart w:id="77" w:name="_Toc236592945"/>
       <w:r>
         <w:rPr>
           <w:b w:val="0"/>
@@ -11940,7 +12277,7 @@
         </w:rPr>
       </w:pPr>
       <w:bookmarkStart w:id="78" w:name="_Toc225758793"/>
-      <w:bookmarkStart w:id="79" w:name="_Toc236486297"/>
+      <w:bookmarkStart w:id="79" w:name="_Toc236592946"/>
       <w:r>
         <w:rPr>
           <w:b w:val="0"/>
@@ -12121,7 +12458,7 @@
         </w:rPr>
       </w:pPr>
       <w:bookmarkStart w:id="80" w:name="_Toc225758794"/>
-      <w:bookmarkStart w:id="81" w:name="_Toc236486298"/>
+      <w:bookmarkStart w:id="81" w:name="_Toc236592947"/>
       <w:r>
         <w:rPr>
           <w:b w:val="0"/>
@@ -12296,7 +12633,7 @@
         </w:rPr>
       </w:pPr>
       <w:bookmarkStart w:id="82" w:name="_Toc225758795"/>
-      <w:bookmarkStart w:id="83" w:name="_Toc236486299"/>
+      <w:bookmarkStart w:id="83" w:name="_Toc236592948"/>
       <w:r>
         <w:rPr>
           <w:b w:val="0"/>
@@ -12474,7 +12811,7 @@
         </w:rPr>
       </w:pPr>
       <w:bookmarkStart w:id="84" w:name="_Toc225758796"/>
-      <w:bookmarkStart w:id="85" w:name="_Toc236486300"/>
+      <w:bookmarkStart w:id="85" w:name="_Toc236592949"/>
       <w:r>
         <w:rPr>
           <w:b w:val="0"/>
@@ -12655,7 +12992,7 @@
         </w:rPr>
       </w:pPr>
       <w:bookmarkStart w:id="86" w:name="_Toc225758797"/>
-      <w:bookmarkStart w:id="87" w:name="_Toc236486301"/>
+      <w:bookmarkStart w:id="87" w:name="_Toc236592950"/>
       <w:r>
         <w:rPr>
           <w:b w:val="0"/>
@@ -12840,7 +13177,7 @@
         </w:rPr>
       </w:pPr>
       <w:bookmarkStart w:id="88" w:name="_Toc225758798"/>
-      <w:bookmarkStart w:id="89" w:name="_Toc236486302"/>
+      <w:bookmarkStart w:id="89" w:name="_Toc236592951"/>
       <w:r>
         <w:rPr>
           <w:b w:val="0"/>
@@ -13024,7 +13361,7 @@
         </w:rPr>
       </w:pPr>
       <w:bookmarkStart w:id="90" w:name="_Toc225758799"/>
-      <w:bookmarkStart w:id="91" w:name="_Toc236486303"/>
+      <w:bookmarkStart w:id="91" w:name="_Toc236592952"/>
       <w:r>
         <w:rPr>
           <w:b w:val="0"/>
@@ -13201,7 +13538,7 @@
         </w:rPr>
       </w:pPr>
       <w:bookmarkStart w:id="92" w:name="_Toc225758800"/>
-      <w:bookmarkStart w:id="93" w:name="_Toc236486304"/>
+      <w:bookmarkStart w:id="93" w:name="_Toc236592953"/>
       <w:r>
         <w:rPr>
           <w:b w:val="0"/>
@@ -13382,7 +13719,7 @@
         </w:rPr>
       </w:pPr>
       <w:bookmarkStart w:id="94" w:name="_Toc225758801"/>
-      <w:bookmarkStart w:id="95" w:name="_Toc236486305"/>
+      <w:bookmarkStart w:id="95" w:name="_Toc236592954"/>
       <w:r>
         <w:rPr>
           <w:b w:val="0"/>
@@ -13560,7 +13897,7 @@
         </w:rPr>
       </w:pPr>
       <w:bookmarkStart w:id="96" w:name="_Toc225758802"/>
-      <w:bookmarkStart w:id="97" w:name="_Toc236486306"/>
+      <w:bookmarkStart w:id="97" w:name="_Toc236592955"/>
       <w:r>
         <w:rPr>
           <w:b w:val="0"/>
@@ -13738,7 +14075,7 @@
         </w:rPr>
       </w:pPr>
       <w:bookmarkStart w:id="98" w:name="_Toc225758803"/>
-      <w:bookmarkStart w:id="99" w:name="_Toc236486307"/>
+      <w:bookmarkStart w:id="99" w:name="_Toc236592956"/>
       <w:r>
         <w:rPr>
           <w:b w:val="0"/>
@@ -13926,12 +14263,12 @@
           <w:bottom w:val="single" w:sz="8" w:space="6" w:color="1F497D"/>
         </w:pBdr>
       </w:pPr>
-      <w:bookmarkStart w:id="100" w:name="_Toc236486308"/>
-      <w:bookmarkStart w:id="101" w:name="_Toc225758804"/>
+      <w:bookmarkStart w:id="100" w:name="_Toc225758804"/>
+      <w:bookmarkStart w:id="101" w:name="_Toc236592957"/>
       <w:r>
         <w:t>15.  Windows Messaging: Architecture and Implementation</w:t>
       </w:r>
-      <w:bookmarkEnd w:id="100"/>
+      <w:bookmarkEnd w:id="101"/>
     </w:p>
     <w:p>
       <w:pPr>
@@ -13961,7 +14298,7 @@
       <w:pPr>
         <w:pStyle w:val="Heading2"/>
       </w:pPr>
-      <w:bookmarkStart w:id="102" w:name="_Toc236486309"/>
+      <w:bookmarkStart w:id="102" w:name="_Toc236592958"/>
       <w:r>
         <w:t>15.1  Background: Why VCL Messaging Cannot Be Ported Directly</w:t>
       </w:r>
@@ -14052,7 +14389,7 @@
       <w:pPr>
         <w:pStyle w:val="Heading2"/>
       </w:pPr>
-      <w:bookmarkStart w:id="103" w:name="_Toc236486310"/>
+      <w:bookmarkStart w:id="103" w:name="_Toc236592959"/>
       <w:r>
         <w:t>15.2  Detection Model: Three Tiers</w:t>
       </w:r>
@@ -14075,7 +14412,7 @@
       <w:pPr>
         <w:pStyle w:val="Heading3"/>
       </w:pPr>
-      <w:bookmarkStart w:id="104" w:name="_Toc236486311"/>
+      <w:bookmarkStart w:id="104" w:name="_Toc236592960"/>
       <w:r>
         <w:rPr>
           <w:bCs/>
@@ -14296,7 +14633,7 @@
       <w:pPr>
         <w:pStyle w:val="Heading3"/>
       </w:pPr>
-      <w:bookmarkStart w:id="105" w:name="_Toc236486312"/>
+      <w:bookmarkStart w:id="105" w:name="_Toc236592961"/>
       <w:r>
         <w:rPr>
           <w:bCs/>
@@ -14523,7 +14860,7 @@
       <w:pPr>
         <w:pStyle w:val="Heading3"/>
       </w:pPr>
-      <w:bookmarkStart w:id="106" w:name="_Toc236486313"/>
+      <w:bookmarkStart w:id="106" w:name="_Toc236592962"/>
       <w:r>
         <w:rPr>
           <w:bCs/>
@@ -14736,7 +15073,7 @@
       <w:pPr>
         <w:pStyle w:val="Heading2"/>
       </w:pPr>
-      <w:bookmarkStart w:id="107" w:name="_Toc236486314"/>
+      <w:bookmarkStart w:id="107" w:name="_Toc236592963"/>
       <w:r>
         <w:t>15.3  ConvertMessageAPI — WinAPI Layer (Converter.Advanced.WinAPI)</w:t>
       </w:r>
@@ -15066,7 +15403,7 @@
       <w:pPr>
         <w:pStyle w:val="Heading2"/>
       </w:pPr>
-      <w:bookmarkStart w:id="108" w:name="_Toc236486315"/>
+      <w:bookmarkStart w:id="108" w:name="_Toc236592964"/>
       <w:r>
         <w:t>15.4  System.Messaging Uses Clause Injection (Converter.Rewrite.UsesClause)</w:t>
       </w:r>
@@ -15280,7 +15617,7 @@
       <w:pPr>
         <w:pStyle w:val="Heading2"/>
       </w:pPr>
-      <w:bookmarkStart w:id="109" w:name="_Toc236486316"/>
+      <w:bookmarkStart w:id="109" w:name="_Toc236592965"/>
       <w:r>
         <w:t>15.5  FMXMessageBridge Infrastructure (Converter.Project.Generator)</w:t>
       </w:r>
@@ -15295,7 +15632,7 @@
       <w:pPr>
         <w:pStyle w:val="Heading3"/>
       </w:pPr>
-      <w:bookmarkStart w:id="110" w:name="_Toc236486317"/>
+      <w:bookmarkStart w:id="110" w:name="_Toc236592966"/>
       <w:r>
         <w:rPr>
           <w:bCs/>
@@ -15448,7 +15785,7 @@
       <w:pPr>
         <w:pStyle w:val="Heading3"/>
       </w:pPr>
-      <w:bookmarkStart w:id="111" w:name="_Toc236486318"/>
+      <w:bookmarkStart w:id="111" w:name="_Toc236592967"/>
       <w:r>
         <w:rPr>
           <w:bCs/>
@@ -15670,7 +16007,7 @@
       <w:pPr>
         <w:pStyle w:val="Heading3"/>
       </w:pPr>
-      <w:bookmarkStart w:id="112" w:name="_Toc236486319"/>
+      <w:bookmarkStart w:id="112" w:name="_Toc236592968"/>
       <w:r>
         <w:rPr>
           <w:bCs/>
@@ -15865,7 +16202,7 @@
       <w:pPr>
         <w:pStyle w:val="Heading2"/>
       </w:pPr>
-      <w:bookmarkStart w:id="113" w:name="_Toc236486320"/>
+      <w:bookmarkStart w:id="113" w:name="_Toc236592969"/>
       <w:r>
         <w:t xml:space="preserve">15.6  Files Modified in </w:t>
       </w:r>
@@ -16311,7 +16648,7 @@
       <w:pPr>
         <w:pStyle w:val="Heading2"/>
       </w:pPr>
-      <w:bookmarkStart w:id="114" w:name="_Toc236486321"/>
+      <w:bookmarkStart w:id="114" w:name="_Toc236592970"/>
       <w:r>
         <w:t>15.7  Regression-Protected Areas</w:t>
       </w:r>
@@ -16810,7 +17147,7 @@
       <w:pPr>
         <w:pStyle w:val="Heading2"/>
       </w:pPr>
-      <w:bookmarkStart w:id="115" w:name="_Toc236486322"/>
+      <w:bookmarkStart w:id="115" w:name="_Toc236592971"/>
       <w:r>
         <w:t>15.8  Known Limitations and Future Work</w:t>
       </w:r>
@@ -16825,7 +17162,7 @@
       <w:pPr>
         <w:pStyle w:val="Heading3"/>
       </w:pPr>
-      <w:bookmarkStart w:id="116" w:name="_Toc236486323"/>
+      <w:bookmarkStart w:id="116" w:name="_Toc236592972"/>
       <w:r>
         <w:t>15.8.1  Not Converted — Manual FMX Decisions Required</w:t>
       </w:r>
@@ -16924,7 +17261,7 @@
       <w:pPr>
         <w:pStyle w:val="Heading3"/>
       </w:pPr>
-      <w:bookmarkStart w:id="117" w:name="_Toc236486324"/>
+      <w:bookmarkStart w:id="117" w:name="_Toc236592973"/>
       <w:r>
         <w:t>15.8.2  Potential Future Enhancements</w:t>
       </w:r>
@@ -17001,14 +17338,14 @@
           <w:b w:val="0"/>
         </w:rPr>
       </w:pPr>
-      <w:bookmarkStart w:id="118" w:name="_Toc236486325"/>
+      <w:bookmarkStart w:id="118" w:name="_Toc236592974"/>
       <w:r>
         <w:rPr>
           <w:b w:val="0"/>
         </w:rPr>
         <w:t>Appendix A. File Inventory</w:t>
       </w:r>
-      <w:bookmarkEnd w:id="101"/>
+      <w:bookmarkEnd w:id="100"/>
       <w:bookmarkEnd w:id="118"/>
     </w:p>
     <w:tbl>
@@ -17375,7 +17712,7 @@
           <w:b w:val="0"/>
         </w:rPr>
       </w:pPr>
-      <w:bookmarkStart w:id="120" w:name="_Toc236486326"/>
+      <w:bookmarkStart w:id="120" w:name="_Toc236592975"/>
       <w:r>
         <w:rPr>
           <w:b w:val="0"/>
@@ -17393,7 +17730,7 @@
         </w:rPr>
       </w:pPr>
       <w:bookmarkStart w:id="121" w:name="_Toc225758806"/>
-      <w:bookmarkStart w:id="122" w:name="_Toc236486327"/>
+      <w:bookmarkStart w:id="122" w:name="_Toc236592976"/>
       <w:r>
         <w:rPr>
           <w:b w:val="0"/>
@@ -17460,7 +17797,7 @@
         </w:rPr>
       </w:pPr>
       <w:bookmarkStart w:id="123" w:name="_Toc225758807"/>
-      <w:bookmarkStart w:id="124" w:name="_Toc236486328"/>
+      <w:bookmarkStart w:id="124" w:name="_Toc236592977"/>
       <w:r>
         <w:rPr>
           <w:b w:val="0"/>
@@ -17572,7 +17909,7 @@
           <w:b w:val="0"/>
         </w:rPr>
       </w:pPr>
-      <w:bookmarkStart w:id="126" w:name="_Toc236486329"/>
+      <w:bookmarkStart w:id="126" w:name="_Toc236592978"/>
       <w:r>
         <w:rPr>
           <w:b w:val="0"/>
@@ -17675,7 +18012,7 @@
           <w:bCs/>
         </w:rPr>
       </w:pPr>
-      <w:bookmarkStart w:id="127" w:name="_Toc236486330"/>
+      <w:bookmarkStart w:id="127" w:name="_Toc236592979"/>
       <w:r>
         <w:rPr>
           <w:b w:val="0"/>
@@ -17689,7 +18026,7 @@
       <w:pPr>
         <w:pStyle w:val="Heading2"/>
       </w:pPr>
-      <w:bookmarkStart w:id="128" w:name="_Toc236486331"/>
+      <w:bookmarkStart w:id="128" w:name="_Toc236592980"/>
       <w:r>
         <w:t>Overview</w:t>
       </w:r>
@@ -17819,7 +18156,7 @@
       <w:pPr>
         <w:pStyle w:val="Heading2"/>
       </w:pPr>
-      <w:bookmarkStart w:id="129" w:name="_Toc236486332"/>
+      <w:bookmarkStart w:id="129" w:name="_Toc236592981"/>
       <w:r>
         <w:t>Operational Model</w:t>
       </w:r>
@@ -17928,7 +18265,7 @@
       <w:pPr>
         <w:pStyle w:val="Heading2"/>
       </w:pPr>
-      <w:bookmarkStart w:id="130" w:name="_Toc236486333"/>
+      <w:bookmarkStart w:id="130" w:name="_Toc236592982"/>
       <w:r>
         <w:t>Connection To The Developer Environment</w:t>
       </w:r>
@@ -18040,7 +18377,7 @@
       <w:pPr>
         <w:pStyle w:val="Heading2"/>
       </w:pPr>
-      <w:bookmarkStart w:id="131" w:name="_Toc236486334"/>
+      <w:bookmarkStart w:id="131" w:name="_Toc236592983"/>
       <w:r>
         <w:t>What Codex Can Place On The Computer</w:t>
       </w:r>
@@ -18162,7 +18499,7 @@
       <w:pPr>
         <w:pStyle w:val="Heading2"/>
       </w:pPr>
-      <w:bookmarkStart w:id="132" w:name="_Toc236486335"/>
+      <w:bookmarkStart w:id="132" w:name="_Toc236592984"/>
       <w:r>
         <w:t>What Codex May Store Or Rely On</w:t>
       </w:r>
@@ -18238,7 +18575,7 @@
       <w:r>
         <w:br/>
       </w:r>
-      <w:bookmarkStart w:id="133" w:name="_Toc236486336"/>
+      <w:bookmarkStart w:id="133" w:name="_Toc236592985"/>
       <w:r>
         <w:t>Expected Developer Experience</w:t>
       </w:r>
@@ -18412,7 +18749,7 @@
       <w:pPr>
         <w:pStyle w:val="Heading2"/>
       </w:pPr>
-      <w:bookmarkStart w:id="134" w:name="_Toc236486337"/>
+      <w:bookmarkStart w:id="134" w:name="_Toc236592986"/>
       <w:r>
         <w:t>Effective Prompting Guidance</w:t>
       </w:r>
@@ -18586,7 +18923,7 @@
       <w:pPr>
         <w:pStyle w:val="Heading2"/>
       </w:pPr>
-      <w:bookmarkStart w:id="135" w:name="_Toc236486338"/>
+      <w:bookmarkStart w:id="135" w:name="_Toc236592987"/>
       <w:r>
         <w:t>What Developers Should Tell Codex</w:t>
       </w:r>
@@ -18752,7 +19089,7 @@
       <w:pPr>
         <w:pStyle w:val="Heading2"/>
       </w:pPr>
-      <w:bookmarkStart w:id="136" w:name="_Toc236486339"/>
+      <w:bookmarkStart w:id="136" w:name="_Toc236592988"/>
       <w:r>
         <w:t>Capabilities</w:t>
       </w:r>
@@ -18866,7 +19203,7 @@
       <w:pPr>
         <w:pStyle w:val="Heading2"/>
       </w:pPr>
-      <w:bookmarkStart w:id="137" w:name="_Toc236486340"/>
+      <w:bookmarkStart w:id="137" w:name="_Toc236592989"/>
       <w:r>
         <w:t>Limitations</w:t>
       </w:r>
@@ -18970,7 +19307,7 @@
       <w:pPr>
         <w:pStyle w:val="Heading2"/>
       </w:pPr>
-      <w:bookmarkStart w:id="138" w:name="_Toc236486341"/>
+      <w:bookmarkStart w:id="138" w:name="_Toc236592990"/>
       <w:r>
         <w:t>Risk Management Guidance</w:t>
       </w:r>
@@ -19136,7 +19473,7 @@
       <w:pPr>
         <w:pStyle w:val="Heading2"/>
       </w:pPr>
-      <w:bookmarkStart w:id="139" w:name="_Toc236486342"/>
+      <w:bookmarkStart w:id="139" w:name="_Toc236592991"/>
       <w:r>
         <w:t>Security And Privacy Considerations</w:t>
       </w:r>
@@ -19232,7 +19569,7 @@
       <w:pPr>
         <w:pStyle w:val="Heading2"/>
       </w:pPr>
-      <w:bookmarkStart w:id="140" w:name="_Toc236486343"/>
+      <w:bookmarkStart w:id="140" w:name="_Toc236592992"/>
       <w:r>
         <w:t>Bottom Line</w:t>
       </w:r>
@@ -19254,7 +19591,7 @@
         </w:rPr>
       </w:pPr>
       <w:bookmarkStart w:id="141" w:name="_Toc225758809"/>
-      <w:bookmarkStart w:id="142" w:name="_Toc236486344"/>
+      <w:bookmarkStart w:id="142" w:name="_Toc236592993"/>
       <w:r>
         <w:rPr>
           <w:b w:val="0"/>
@@ -19631,7 +19968,7 @@
       <w:pPr>
         <w:pStyle w:val="Heading1"/>
       </w:pPr>
-      <w:bookmarkStart w:id="143" w:name="_Toc236486345"/>
+      <w:bookmarkStart w:id="143" w:name="_Toc236592994"/>
       <w:r>
         <w:t xml:space="preserve">Maintenance Update - </w:t>
       </w:r>
@@ -19673,9 +20010,14 @@
       <w:pPr>
         <w:pStyle w:val="Heading1"/>
       </w:pPr>
-      <w:r>
-        <w:t>Navigator Build 021</w:t>
-      </w:r>
+      <w:bookmarkStart w:id="144" w:name="_Toc236592995"/>
+      <w:r>
+        <w:t xml:space="preserve">Navigator </w:t>
+      </w:r>
+      <w:r>
+        <w:t>Build 023</w:t>
+      </w:r>
+      <w:bookmarkEnd w:id="144"/>
     </w:p>
     <w:p>
       <w:r>
@@ -19687,9 +20029,14 @@
       <w:pPr>
         <w:pStyle w:val="Heading2"/>
       </w:pPr>
-      <w:r>
-        <w:t>Architecture completed through Build 021</w:t>
-      </w:r>
+      <w:bookmarkStart w:id="145" w:name="_Toc236592996"/>
+      <w:r>
+        <w:t xml:space="preserve">Architecture completed through </w:t>
+      </w:r>
+      <w:r>
+        <w:t>Build 023</w:t>
+      </w:r>
+      <w:bookmarkEnd w:id="145"/>
     </w:p>
     <w:p>
       <w:r>
@@ -19701,9 +20048,11 @@
       <w:pPr>
         <w:pStyle w:val="Heading2"/>
       </w:pPr>
+      <w:bookmarkStart w:id="146" w:name="_Toc236592997"/>
       <w:r>
         <w:t>Mapping-pack discipline</w:t>
       </w:r>
+      <w:bookmarkEnd w:id="146"/>
     </w:p>
     <w:p>
       <w:r>
@@ -19715,13 +20064,30 @@
       <w:pPr>
         <w:pStyle w:val="Heading2"/>
       </w:pPr>
+      <w:bookmarkStart w:id="147" w:name="_Toc236592998"/>
       <w:r>
         <w:t>Validation baseline</w:t>
       </w:r>
-    </w:p>
-    <w:p>
-      <w:r>
-        <w:t>Build 021 is guarded by 227 executable conversion contracts, 64 regression guards, 62 acceptance checks, mapping-pack positive and negative suites, French beta regression, mapping smoke coverage, Win32 and Win64 Release builds, and compilation of every eligible generated contract fixture. Synthetic malformed, missing, external, dry-run, and manual-review fixtures explicitly declare when compilation is not applicable.</w:t>
+      <w:bookmarkEnd w:id="147"/>
+    </w:p>
+    <w:p>
+      <w:r>
+        <w:t>Build 023</w:t>
+      </w:r>
+      <w:r>
+        <w:t xml:space="preserve"> is guarded by 227 executable conversion contracts, </w:t>
+      </w:r>
+      <w:r>
+        <w:t>65 regression guards</w:t>
+      </w:r>
+      <w:r>
+        <w:t xml:space="preserve">, </w:t>
+      </w:r>
+      <w:r>
+        <w:t>63 acceptance checks</w:t>
+      </w:r>
+      <w:r>
+        <w:t>, mapping-pack positive and negative suites, French beta regression, mapping smoke coverage, Win32 and Win64 Release builds, and compilation of every eligible generated contract fixture. Synthetic malformed, missing, external, dry-run, and manual-review fixtures explicitly declare when compilation is not applicable.</w:t>
       </w:r>
     </w:p>
     <w:p/>
@@ -19729,9 +20095,14 @@
       <w:pPr>
         <w:pStyle w:val="Heading2"/>
       </w:pPr>
-      <w:r>
-        <w:t>Build 021 conversion corrections</w:t>
-      </w:r>
+      <w:bookmarkStart w:id="148" w:name="_Toc236592999"/>
+      <w:r>
+        <w:t>Build 023</w:t>
+      </w:r>
+      <w:r>
+        <w:t xml:space="preserve"> conversion corrections</w:t>
+      </w:r>
+      <w:bookmarkEnd w:id="148"/>
     </w:p>
     <w:p>
       <w:r>
@@ -19740,6 +20111,12 @@
     </w:p>
     <w:p/>
     <w:sectPr>
+      <w:headerReference w:type="even" r:id="rId10"/>
+      <w:headerReference w:type="default" r:id="rId11"/>
+      <w:footerReference w:type="even" r:id="rId12"/>
+      <w:footerReference w:type="default" r:id="rId13"/>
+      <w:headerReference w:type="first" r:id="rId14"/>
+      <w:footerReference w:type="first" r:id="rId15"/>
       <w:pgSz w:w="12240" w:h="15840"/>
       <w:pgMar w:top="1080" w:right="1080" w:bottom="1080" w:left="1080" w:header="720" w:footer="720" w:gutter="0"/>
       <w:cols w:space="720"/>
@@ -19774,6 +20151,36 @@
 </w:endnotes>
 </file>
 
+<file path=word/footer1.xml><?xml version="1.0" encoding="utf-8"?>
+<w:ftr xmlns:wpc="http://schemas.microsoft.com/office/word/2010/wordprocessingCanvas" xmlns:cx="http://schemas.microsoft.com/office/drawing/2014/chartex" xmlns:cx1="http://schemas.microsoft.com/office/drawing/2015/9/8/chartex" xmlns:cx2="http://schemas.microsoft.com/office/drawing/2015/10/21/chartex" xmlns:cx3="http://schemas.microsoft.com/office/drawing/2016/5/9/chartex" xmlns:cx4="http://schemas.microsoft.com/office/drawing/2016/5/10/chartex" xmlns:cx5="http://schemas.microsoft.com/office/drawing/2016/5/11/chartex" xmlns:cx6="http://schemas.microsoft.com/office/drawing/2016/5/12/chartex" xmlns:cx7="http://schemas.microsoft.com/office/drawing/2016/5/13/chartex" xmlns:cx8="http://schemas.microsoft.com/office/drawing/2016/5/14/chartex" xmlns:mc="http://schemas.openxmlformats.org/markup-compatibility/2006" xmlns:aink="http://schemas.microsoft.com/office/drawing/2016/ink" xmlns:am3d="http://schemas.microsoft.com/office/drawing/2017/model3d" xmlns:o="urn:schemas-microsoft-com:office:office" xmlns:oel="http://schemas.microsoft.com/office/2019/extlst" xmlns:r="http://schemas.openxmlformats.org/officeDocument/2006/relationships" xmlns:m="http://schemas.openxmlformats.org/officeDocument/2006/math" xmlns:v="urn:schemas-microsoft-com:vml" xmlns:wp14="http://schemas.microsoft.com/office/word/2010/wordprocessingDrawing" xmlns:wp="http://schemas.openxmlformats.org/drawingml/2006/wordprocessingDrawing" xmlns:w10="urn:schemas-microsoft-com:office:word" xmlns:w="http://schemas.openxmlformats.org/wordprocessingml/2006/main" xmlns:w14="http://schemas.microsoft.com/office/word/2010/wordml" xmlns:w15="http://schemas.microsoft.com/office/word/2012/wordml" xmlns:w16cei="http://schemas.microsoft.com/office/word/2026/wordml/cei" xmlns:w16cex="http://schemas.microsoft.com/office/word/2018/wordml/cex" xmlns:w16cid="http://schemas.microsoft.com/office/word/2016/wordml/cid" xmlns:w16="http://schemas.microsoft.com/office/word/2018/wordml" xmlns:w16du="http://schemas.microsoft.com/office/word/2023/wordml/word16du" xmlns:w16sdtdh="http://schemas.microsoft.com/office/word/2020/wordml/sdtdatahash" xmlns:w16sdtfl="http://schemas.microsoft.com/office/word/2024/wordml/sdtformatlock" xmlns:w16se="http://schemas.microsoft.com/office/word/2015/wordml/symex" xmlns:wpg="http://schemas.microsoft.com/office/word/2010/wordprocessingGroup" xmlns:wpi="http://schemas.microsoft.com/office/word/2010/wordprocessingInk" xmlns:wne="http://schemas.microsoft.com/office/word/2006/wordml" xmlns:wps="http://schemas.microsoft.com/office/word/2010/wordprocessingShape" mc:Ignorable="w14 w15 w16se w16cid w16 w16cex w16sdtdh w16sdtfl w16du wp14">
+  <w:p>
+    <w:pPr>
+      <w:pStyle w:val="Footer"/>
+    </w:pPr>
+  </w:p>
+</w:ftr>
+</file>
+
+<file path=word/footer2.xml><?xml version="1.0" encoding="utf-8"?>
+<w:ftr xmlns:wpc="http://schemas.microsoft.com/office/word/2010/wordprocessingCanvas" xmlns:cx="http://schemas.microsoft.com/office/drawing/2014/chartex" xmlns:cx1="http://schemas.microsoft.com/office/drawing/2015/9/8/chartex" xmlns:cx2="http://schemas.microsoft.com/office/drawing/2015/10/21/chartex" xmlns:cx3="http://schemas.microsoft.com/office/drawing/2016/5/9/chartex" xmlns:cx4="http://schemas.microsoft.com/office/drawing/2016/5/10/chartex" xmlns:cx5="http://schemas.microsoft.com/office/drawing/2016/5/11/chartex" xmlns:cx6="http://schemas.microsoft.com/office/drawing/2016/5/12/chartex" xmlns:cx7="http://schemas.microsoft.com/office/drawing/2016/5/13/chartex" xmlns:cx8="http://schemas.microsoft.com/office/drawing/2016/5/14/chartex" xmlns:mc="http://schemas.openxmlformats.org/markup-compatibility/2006" xmlns:aink="http://schemas.microsoft.com/office/drawing/2016/ink" xmlns:am3d="http://schemas.microsoft.com/office/drawing/2017/model3d" xmlns:o="urn:schemas-microsoft-com:office:office" xmlns:oel="http://schemas.microsoft.com/office/2019/extlst" xmlns:r="http://schemas.openxmlformats.org/officeDocument/2006/relationships" xmlns:m="http://schemas.openxmlformats.org/officeDocument/2006/math" xmlns:v="urn:schemas-microsoft-com:vml" xmlns:wp14="http://schemas.microsoft.com/office/word/2010/wordprocessingDrawing" xmlns:wp="http://schemas.openxmlformats.org/drawingml/2006/wordprocessingDrawing" xmlns:w10="urn:schemas-microsoft-com:office:word" xmlns:w="http://schemas.openxmlformats.org/wordprocessingml/2006/main" xmlns:w14="http://schemas.microsoft.com/office/word/2010/wordml" xmlns:w15="http://schemas.microsoft.com/office/word/2012/wordml" xmlns:w16cei="http://schemas.microsoft.com/office/word/2026/wordml/cei" xmlns:w16cex="http://schemas.microsoft.com/office/word/2018/wordml/cex" xmlns:w16cid="http://schemas.microsoft.com/office/word/2016/wordml/cid" xmlns:w16="http://schemas.microsoft.com/office/word/2018/wordml" xmlns:w16du="http://schemas.microsoft.com/office/word/2023/wordml/word16du" xmlns:w16sdtdh="http://schemas.microsoft.com/office/word/2020/wordml/sdtdatahash" xmlns:w16sdtfl="http://schemas.microsoft.com/office/word/2024/wordml/sdtformatlock" xmlns:w16se="http://schemas.microsoft.com/office/word/2015/wordml/symex" xmlns:wpg="http://schemas.microsoft.com/office/word/2010/wordprocessingGroup" xmlns:wpi="http://schemas.microsoft.com/office/word/2010/wordprocessingInk" xmlns:wne="http://schemas.microsoft.com/office/word/2006/wordml" xmlns:wps="http://schemas.microsoft.com/office/word/2010/wordprocessingShape" mc:Ignorable="w14 w15 w16se w16cid w16 w16cex w16sdtdh w16sdtfl w16du wp14">
+  <w:p>
+    <w:pPr>
+      <w:pStyle w:val="Footer"/>
+    </w:pPr>
+  </w:p>
+</w:ftr>
+</file>
+
+<file path=word/footer3.xml><?xml version="1.0" encoding="utf-8"?>
+<w:ftr xmlns:wpc="http://schemas.microsoft.com/office/word/2010/wordprocessingCanvas" xmlns:cx="http://schemas.microsoft.com/office/drawing/2014/chartex" xmlns:cx1="http://schemas.microsoft.com/office/drawing/2015/9/8/chartex" xmlns:cx2="http://schemas.microsoft.com/office/drawing/2015/10/21/chartex" xmlns:cx3="http://schemas.microsoft.com/office/drawing/2016/5/9/chartex" xmlns:cx4="http://schemas.microsoft.com/office/drawing/2016/5/10/chartex" xmlns:cx5="http://schemas.microsoft.com/office/drawing/2016/5/11/chartex" xmlns:cx6="http://schemas.microsoft.com/office/drawing/2016/5/12/chartex" xmlns:cx7="http://schemas.microsoft.com/office/drawing/2016/5/13/chartex" xmlns:cx8="http://schemas.microsoft.com/office/drawing/2016/5/14/chartex" xmlns:mc="http://schemas.openxmlformats.org/markup-compatibility/2006" xmlns:aink="http://schemas.microsoft.com/office/drawing/2016/ink" xmlns:am3d="http://schemas.microsoft.com/office/drawing/2017/model3d" xmlns:o="urn:schemas-microsoft-com:office:office" xmlns:oel="http://schemas.microsoft.com/office/2019/extlst" xmlns:r="http://schemas.openxmlformats.org/officeDocument/2006/relationships" xmlns:m="http://schemas.openxmlformats.org/officeDocument/2006/math" xmlns:v="urn:schemas-microsoft-com:vml" xmlns:wp14="http://schemas.microsoft.com/office/word/2010/wordprocessingDrawing" xmlns:wp="http://schemas.openxmlformats.org/drawingml/2006/wordprocessingDrawing" xmlns:w10="urn:schemas-microsoft-com:office:word" xmlns:w="http://schemas.openxmlformats.org/wordprocessingml/2006/main" xmlns:w14="http://schemas.microsoft.com/office/word/2010/wordml" xmlns:w15="http://schemas.microsoft.com/office/word/2012/wordml" xmlns:w16cei="http://schemas.microsoft.com/office/word/2026/wordml/cei" xmlns:w16cex="http://schemas.microsoft.com/office/word/2018/wordml/cex" xmlns:w16cid="http://schemas.microsoft.com/office/word/2016/wordml/cid" xmlns:w16="http://schemas.microsoft.com/office/word/2018/wordml" xmlns:w16du="http://schemas.microsoft.com/office/word/2023/wordml/word16du" xmlns:w16sdtdh="http://schemas.microsoft.com/office/word/2020/wordml/sdtdatahash" xmlns:w16sdtfl="http://schemas.microsoft.com/office/word/2024/wordml/sdtformatlock" xmlns:w16se="http://schemas.microsoft.com/office/word/2015/wordml/symex" xmlns:wpg="http://schemas.microsoft.com/office/word/2010/wordprocessingGroup" xmlns:wpi="http://schemas.microsoft.com/office/word/2010/wordprocessingInk" xmlns:wne="http://schemas.microsoft.com/office/word/2006/wordml" xmlns:wps="http://schemas.microsoft.com/office/word/2010/wordprocessingShape" mc:Ignorable="w14 w15 w16se w16cid w16 w16cex w16sdtdh w16sdtfl w16du wp14">
+  <w:p>
+    <w:pPr>
+      <w:pStyle w:val="Footer"/>
+    </w:pPr>
+  </w:p>
+</w:ftr>
+</file>
+
 <file path=word/footnotes.xml><?xml version="1.0" encoding="utf-8"?>
 <w:footnotes xmlns:wpc="http://schemas.microsoft.com/office/word/2010/wordprocessingCanvas" xmlns:cx="http://schemas.microsoft.com/office/drawing/2014/chartex" xmlns:cx1="http://schemas.microsoft.com/office/drawing/2015/9/8/chartex" xmlns:cx2="http://schemas.microsoft.com/office/drawing/2015/10/21/chartex" xmlns:cx3="http://schemas.microsoft.com/office/drawing/2016/5/9/chartex" xmlns:cx4="http://schemas.microsoft.com/office/drawing/2016/5/10/chartex" xmlns:cx5="http://schemas.microsoft.com/office/drawing/2016/5/11/chartex" xmlns:cx6="http://schemas.microsoft.com/office/drawing/2016/5/12/chartex" xmlns:cx7="http://schemas.microsoft.com/office/drawing/2016/5/13/chartex" xmlns:cx8="http://schemas.microsoft.com/office/drawing/2016/5/14/chartex" xmlns:mc="http://schemas.openxmlformats.org/markup-compatibility/2006" xmlns:aink="http://schemas.microsoft.com/office/drawing/2016/ink" xmlns:am3d="http://schemas.microsoft.com/office/drawing/2017/model3d" xmlns:o="urn:schemas-microsoft-com:office:office" xmlns:oel="http://schemas.microsoft.com/office/2019/extlst" xmlns:r="http://schemas.openxmlformats.org/officeDocument/2006/relationships" xmlns:m="http://schemas.openxmlformats.org/officeDocument/2006/math" xmlns:v="urn:schemas-microsoft-com:vml" xmlns:wp14="http://schemas.microsoft.com/office/word/2010/wordprocessingDrawing" xmlns:wp="http://schemas.openxmlformats.org/drawingml/2006/wordprocessingDrawing" xmlns:w10="urn:schemas-microsoft-com:office:word" xmlns:w="http://schemas.openxmlformats.org/wordprocessingml/2006/main" xmlns:w14="http://schemas.microsoft.com/office/word/2010/wordml" xmlns:w15="http://schemas.microsoft.com/office/word/2012/wordml" xmlns:w16cei="http://schemas.microsoft.com/office/word/2026/wordml/cei" xmlns:w16cex="http://schemas.microsoft.com/office/word/2018/wordml/cex" xmlns:w16cid="http://schemas.microsoft.com/office/word/2016/wordml/cid" xmlns:w16="http://schemas.microsoft.com/office/word/2018/wordml" xmlns:w16du="http://schemas.microsoft.com/office/word/2023/wordml/word16du" xmlns:w16sdtdh="http://schemas.microsoft.com/office/word/2020/wordml/sdtdatahash" xmlns:w16sdtfl="http://schemas.microsoft.com/office/word/2024/wordml/sdtformatlock" xmlns:w16se="http://schemas.microsoft.com/office/word/2015/wordml/symex" xmlns:wpg="http://schemas.microsoft.com/office/word/2010/wordprocessingGroup" xmlns:wpi="http://schemas.microsoft.com/office/word/2010/wordprocessingInk" xmlns:wne="http://schemas.microsoft.com/office/word/2006/wordml" xmlns:wps="http://schemas.microsoft.com/office/word/2010/wordprocessingShape" mc:Ignorable="w14 w15 w16se w16cid w16 w16cex w16sdtdh w16sdtfl w16du wp14">
   <w:footnote w:type="separator" w:id="-1">
@@ -19797,6 +20204,36 @@
     </w:p>
   </w:footnote>
 </w:footnotes>
+</file>
+
+<file path=word/header1.xml><?xml version="1.0" encoding="utf-8"?>
+<w:hdr xmlns:wpc="http://schemas.microsoft.com/office/word/2010/wordprocessingCanvas" xmlns:cx="http://schemas.microsoft.com/office/drawing/2014/chartex" xmlns:cx1="http://schemas.microsoft.com/office/drawing/2015/9/8/chartex" xmlns:cx2="http://schemas.microsoft.com/office/drawing/2015/10/21/chartex" xmlns:cx3="http://schemas.microsoft.com/office/drawing/2016/5/9/chartex" xmlns:cx4="http://schemas.microsoft.com/office/drawing/2016/5/10/chartex" xmlns:cx5="http://schemas.microsoft.com/office/drawing/2016/5/11/chartex" xmlns:cx6="http://schemas.microsoft.com/office/drawing/2016/5/12/chartex" xmlns:cx7="http://schemas.microsoft.com/office/drawing/2016/5/13/chartex" xmlns:cx8="http://schemas.microsoft.com/office/drawing/2016/5/14/chartex" xmlns:mc="http://schemas.openxmlformats.org/markup-compatibility/2006" xmlns:aink="http://schemas.microsoft.com/office/drawing/2016/ink" xmlns:am3d="http://schemas.microsoft.com/office/drawing/2017/model3d" xmlns:o="urn:schemas-microsoft-com:office:office" xmlns:oel="http://schemas.microsoft.com/office/2019/extlst" xmlns:r="http://schemas.openxmlformats.org/officeDocument/2006/relationships" xmlns:m="http://schemas.openxmlformats.org/officeDocument/2006/math" xmlns:v="urn:schemas-microsoft-com:vml" xmlns:wp14="http://schemas.microsoft.com/office/word/2010/wordprocessingDrawing" xmlns:wp="http://schemas.openxmlformats.org/drawingml/2006/wordprocessingDrawing" xmlns:w10="urn:schemas-microsoft-com:office:word" xmlns:w="http://schemas.openxmlformats.org/wordprocessingml/2006/main" xmlns:w14="http://schemas.microsoft.com/office/word/2010/wordml" xmlns:w15="http://schemas.microsoft.com/office/word/2012/wordml" xmlns:w16cei="http://schemas.microsoft.com/office/word/2026/wordml/cei" xmlns:w16cex="http://schemas.microsoft.com/office/word/2018/wordml/cex" xmlns:w16cid="http://schemas.microsoft.com/office/word/2016/wordml/cid" xmlns:w16="http://schemas.microsoft.com/office/word/2018/wordml" xmlns:w16du="http://schemas.microsoft.com/office/word/2023/wordml/word16du" xmlns:w16sdtdh="http://schemas.microsoft.com/office/word/2020/wordml/sdtdatahash" xmlns:w16sdtfl="http://schemas.microsoft.com/office/word/2024/wordml/sdtformatlock" xmlns:w16se="http://schemas.microsoft.com/office/word/2015/wordml/symex" xmlns:wpg="http://schemas.microsoft.com/office/word/2010/wordprocessingGroup" xmlns:wpi="http://schemas.microsoft.com/office/word/2010/wordprocessingInk" xmlns:wne="http://schemas.microsoft.com/office/word/2006/wordml" xmlns:wps="http://schemas.microsoft.com/office/word/2010/wordprocessingShape" mc:Ignorable="w14 w15 w16se w16cid w16 w16cex w16sdtdh w16sdtfl w16du wp14">
+  <w:p>
+    <w:pPr>
+      <w:pStyle w:val="Header"/>
+    </w:pPr>
+  </w:p>
+</w:hdr>
+</file>
+
+<file path=word/header2.xml><?xml version="1.0" encoding="utf-8"?>
+<w:hdr xmlns:wpc="http://schemas.microsoft.com/office/word/2010/wordprocessingCanvas" xmlns:cx="http://schemas.microsoft.com/office/drawing/2014/chartex" xmlns:cx1="http://schemas.microsoft.com/office/drawing/2015/9/8/chartex" xmlns:cx2="http://schemas.microsoft.com/office/drawing/2015/10/21/chartex" xmlns:cx3="http://schemas.microsoft.com/office/drawing/2016/5/9/chartex" xmlns:cx4="http://schemas.microsoft.com/office/drawing/2016/5/10/chartex" xmlns:cx5="http://schemas.microsoft.com/office/drawing/2016/5/11/chartex" xmlns:cx6="http://schemas.microsoft.com/office/drawing/2016/5/12/chartex" xmlns:cx7="http://schemas.microsoft.com/office/drawing/2016/5/13/chartex" xmlns:cx8="http://schemas.microsoft.com/office/drawing/2016/5/14/chartex" xmlns:mc="http://schemas.openxmlformats.org/markup-compatibility/2006" xmlns:aink="http://schemas.microsoft.com/office/drawing/2016/ink" xmlns:am3d="http://schemas.microsoft.com/office/drawing/2017/model3d" xmlns:o="urn:schemas-microsoft-com:office:office" xmlns:oel="http://schemas.microsoft.com/office/2019/extlst" xmlns:r="http://schemas.openxmlformats.org/officeDocument/2006/relationships" xmlns:m="http://schemas.openxmlformats.org/officeDocument/2006/math" xmlns:v="urn:schemas-microsoft-com:vml" xmlns:wp14="http://schemas.microsoft.com/office/word/2010/wordprocessingDrawing" xmlns:wp="http://schemas.openxmlformats.org/drawingml/2006/wordprocessingDrawing" xmlns:w10="urn:schemas-microsoft-com:office:word" xmlns:w="http://schemas.openxmlformats.org/wordprocessingml/2006/main" xmlns:w14="http://schemas.microsoft.com/office/word/2010/wordml" xmlns:w15="http://schemas.microsoft.com/office/word/2012/wordml" xmlns:w16cei="http://schemas.microsoft.com/office/word/2026/wordml/cei" xmlns:w16cex="http://schemas.microsoft.com/office/word/2018/wordml/cex" xmlns:w16cid="http://schemas.microsoft.com/office/word/2016/wordml/cid" xmlns:w16="http://schemas.microsoft.com/office/word/2018/wordml" xmlns:w16du="http://schemas.microsoft.com/office/word/2023/wordml/word16du" xmlns:w16sdtdh="http://schemas.microsoft.com/office/word/2020/wordml/sdtdatahash" xmlns:w16sdtfl="http://schemas.microsoft.com/office/word/2024/wordml/sdtformatlock" xmlns:w16se="http://schemas.microsoft.com/office/word/2015/wordml/symex" xmlns:wpg="http://schemas.microsoft.com/office/word/2010/wordprocessingGroup" xmlns:wpi="http://schemas.microsoft.com/office/word/2010/wordprocessingInk" xmlns:wne="http://schemas.microsoft.com/office/word/2006/wordml" xmlns:wps="http://schemas.microsoft.com/office/word/2010/wordprocessingShape" mc:Ignorable="w14 w15 w16se w16cid w16 w16cex w16sdtdh w16sdtfl w16du wp14">
+  <w:p>
+    <w:pPr>
+      <w:pStyle w:val="Header"/>
+    </w:pPr>
+  </w:p>
+</w:hdr>
+</file>
+
+<file path=word/header3.xml><?xml version="1.0" encoding="utf-8"?>
+<w:hdr xmlns:wpc="http://schemas.microsoft.com/office/word/2010/wordprocessingCanvas" xmlns:cx="http://schemas.microsoft.com/office/drawing/2014/chartex" xmlns:cx1="http://schemas.microsoft.com/office/drawing/2015/9/8/chartex" xmlns:cx2="http://schemas.microsoft.com/office/drawing/2015/10/21/chartex" xmlns:cx3="http://schemas.microsoft.com/office/drawing/2016/5/9/chartex" xmlns:cx4="http://schemas.microsoft.com/office/drawing/2016/5/10/chartex" xmlns:cx5="http://schemas.microsoft.com/office/drawing/2016/5/11/chartex" xmlns:cx6="http://schemas.microsoft.com/office/drawing/2016/5/12/chartex" xmlns:cx7="http://schemas.microsoft.com/office/drawing/2016/5/13/chartex" xmlns:cx8="http://schemas.microsoft.com/office/drawing/2016/5/14/chartex" xmlns:mc="http://schemas.openxmlformats.org/markup-compatibility/2006" xmlns:aink="http://schemas.microsoft.com/office/drawing/2016/ink" xmlns:am3d="http://schemas.microsoft.com/office/drawing/2017/model3d" xmlns:o="urn:schemas-microsoft-com:office:office" xmlns:oel="http://schemas.microsoft.com/office/2019/extlst" xmlns:r="http://schemas.openxmlformats.org/officeDocument/2006/relationships" xmlns:m="http://schemas.openxmlformats.org/officeDocument/2006/math" xmlns:v="urn:schemas-microsoft-com:vml" xmlns:wp14="http://schemas.microsoft.com/office/word/2010/wordprocessingDrawing" xmlns:wp="http://schemas.openxmlformats.org/drawingml/2006/wordprocessingDrawing" xmlns:w10="urn:schemas-microsoft-com:office:word" xmlns:w="http://schemas.openxmlformats.org/wordprocessingml/2006/main" xmlns:w14="http://schemas.microsoft.com/office/word/2010/wordml" xmlns:w15="http://schemas.microsoft.com/office/word/2012/wordml" xmlns:w16cei="http://schemas.microsoft.com/office/word/2026/wordml/cei" xmlns:w16cex="http://schemas.microsoft.com/office/word/2018/wordml/cex" xmlns:w16cid="http://schemas.microsoft.com/office/word/2016/wordml/cid" xmlns:w16="http://schemas.microsoft.com/office/word/2018/wordml" xmlns:w16du="http://schemas.microsoft.com/office/word/2023/wordml/word16du" xmlns:w16sdtdh="http://schemas.microsoft.com/office/word/2020/wordml/sdtdatahash" xmlns:w16sdtfl="http://schemas.microsoft.com/office/word/2024/wordml/sdtformatlock" xmlns:w16se="http://schemas.microsoft.com/office/word/2015/wordml/symex" xmlns:wpg="http://schemas.microsoft.com/office/word/2010/wordprocessingGroup" xmlns:wpi="http://schemas.microsoft.com/office/word/2010/wordprocessingInk" xmlns:wne="http://schemas.microsoft.com/office/word/2006/wordml" xmlns:wps="http://schemas.microsoft.com/office/word/2010/wordprocessingShape" mc:Ignorable="w14 w15 w16se w16cid w16 w16cex w16sdtdh w16sdtfl w16du wp14">
+  <w:p>
+    <w:pPr>
+      <w:pStyle w:val="Header"/>
+    </w:pPr>
+  </w:p>
+</w:hdr>
 </file>
 
 <file path=word/numbering.xml><?xml version="1.0" encoding="utf-8"?>

</xml_diff>